<commit_message>
Drop the FSKXpert logo from the activity report cover
Co-Authored-By: Claude Opus 5.5 <noreply@anthropic.com>
Claude-Session: https://claude.ai/code/session_01SYfUBsrHyLu7Shnz5SqzmU
</commit_message>
<xml_diff>
--- a/laporan/laporan-aktiviti-pemasaran.docx
+++ b/laporan/laporan-aktiviti-pemasaran.docx
@@ -10,7 +10,7 @@
       <w:r>
         <w:drawing>
           <wp:inline distT="0" distB="0" distL="0" distR="0">
-            <wp:extent cx="2190750" cy="1038225"/>
+            <wp:extent cx="2667000" cy="1257300"/>
             <wp:effectExtent t="0" r="0" b="0" l="0"/>
             <wp:docPr id="1" name="" descr="" title=""/>
             <wp:cNvGraphicFramePr>
@@ -35,7 +35,7 @@
                   <pic:spPr bwMode="auto">
                     <a:xfrm>
                       <a:off x="0" y="0"/>
-                      <a:ext cx="2190750" cy="1038225"/>
+                      <a:ext cx="2667000" cy="1257300"/>
                     </a:xfrm>
                     <a:prstGeom prst="rect">
                       <a:avLst/>
@@ -47,13 +47,1838 @@
           </wp:inline>
         </w:drawing>
       </w:r>
-      <w:r>
-        <w:t xml:space="preserve">        </w:t>
-      </w:r>
+    </w:p>
+    <w:p>
+      <w:pPr>
+        <w:spacing w:after="200"/>
+        <w:jc w:val="center"/>
+      </w:pPr>
+      <w:r>
+        <w:rPr>
+          <w:b/>
+          <w:bCs/>
+          <w:sz w:val="36"/>
+          <w:szCs w:val="36"/>
+        </w:rPr>
+        <w:t xml:space="preserve">LAPORAN AKTIVITI PEMASARAN</w:t>
+      </w:r>
+    </w:p>
+    <w:p>
+      <w:pPr>
+        <w:spacing w:after="80"/>
+        <w:jc w:val="center"/>
+      </w:pPr>
+      <w:r>
+        <w:rPr>
+          <w:b/>
+          <w:bCs/>
+          <w:sz w:val="28"/>
+          <w:szCs w:val="28"/>
+        </w:rPr>
+        <w:t xml:space="preserve">E-BOOK BUKU MEWARNA FSKXPERT</w:t>
+      </w:r>
+    </w:p>
+    <w:p>
+      <w:pPr>
+        <w:spacing w:after="900"/>
+        <w:jc w:val="center"/>
+      </w:pPr>
+      <w:r>
+        <w:rPr>
+          <w:b/>
+          <w:bCs/>
+          <w:sz w:val="28"/>
+          <w:szCs w:val="28"/>
+        </w:rPr>
+        <w:t xml:space="preserve">MELALUI WHATSAPP DAN MEDIA SOSIAL</w:t>
+      </w:r>
+    </w:p>
+    <w:p>
+      <w:pPr>
+        <w:spacing w:after="100"/>
+        <w:jc w:val="center"/>
+      </w:pPr>
+      <w:r>
+        <w:rPr>
+          <w:b/>
+          <w:bCs/>
+          <w:sz w:val="22"/>
+          <w:szCs w:val="22"/>
+        </w:rPr>
+        <w:t xml:space="preserve">DISEDIAKAN UNTUK:</w:t>
+      </w:r>
+    </w:p>
+    <w:p>
+      <w:pPr>
+        <w:spacing w:after="80"/>
+        <w:jc w:val="center"/>
+      </w:pPr>
+      <w:r>
+        <w:rPr>
+          <w:highlight w:val="yellow"/>
+          <w:highlightCs w:val="yellow"/>
+        </w:rPr>
+        <w:t xml:space="preserve">[NAMA PENYELIA]</w:t>
+      </w:r>
+    </w:p>
+    <w:p>
+      <w:pPr>
+        <w:spacing w:after="80"/>
+        <w:jc w:val="center"/>
+      </w:pPr>
+      <w:r>
+        <w:rPr>
+          <w:b w:val="false"/>
+          <w:bCs w:val="false"/>
+          <w:sz w:val="22"/>
+          <w:szCs w:val="22"/>
+        </w:rPr>
+        <w:t xml:space="preserve">Penyelia Latihan Industri</w:t>
+      </w:r>
+    </w:p>
+    <w:p>
+      <w:pPr>
+        <w:spacing w:after="600"/>
+        <w:jc w:val="center"/>
+      </w:pPr>
+      <w:r>
+        <w:rPr>
+          <w:b w:val="false"/>
+          <w:bCs w:val="false"/>
+          <w:sz w:val="22"/>
+          <w:szCs w:val="22"/>
+        </w:rPr>
+        <w:t xml:space="preserve">Fakulti Sains Kemanusiaan</w:t>
+      </w:r>
+    </w:p>
+    <w:p>
+      <w:pPr>
+        <w:spacing w:after="100"/>
+        <w:jc w:val="center"/>
+      </w:pPr>
+      <w:r>
+        <w:rPr>
+          <w:b/>
+          <w:bCs/>
+          <w:sz w:val="22"/>
+          <w:szCs w:val="22"/>
+        </w:rPr>
+        <w:t xml:space="preserve">DISEDIAKAN OLEH:</w:t>
+      </w:r>
+    </w:p>
+    <w:p>
+      <w:pPr>
+        <w:spacing w:after="80"/>
+        <w:jc w:val="center"/>
+      </w:pPr>
+      <w:r>
+        <w:rPr>
+          <w:b w:val="false"/>
+          <w:bCs w:val="false"/>
+          <w:sz w:val="22"/>
+          <w:szCs w:val="22"/>
+        </w:rPr>
+        <w:t xml:space="preserve">NUR FATIN LIYANA BINTI MOHD FAZIL</w:t>
+      </w:r>
+    </w:p>
+    <w:p>
+      <w:pPr>
+        <w:spacing w:after="600"/>
+        <w:jc w:val="center"/>
+      </w:pPr>
+      <w:r>
+        <w:rPr>
+          <w:b w:val="false"/>
+          <w:bCs w:val="false"/>
+          <w:sz w:val="22"/>
+          <w:szCs w:val="22"/>
+        </w:rPr>
+        <w:t xml:space="preserve">E20251036252</w:t>
+      </w:r>
+    </w:p>
+    <w:p>
+      <w:pPr>
+        <w:spacing w:after="80"/>
+        <w:jc w:val="center"/>
+      </w:pPr>
+      <w:r>
+        <w:rPr>
+          <w:b/>
+          <w:bCs/>
+          <w:sz w:val="22"/>
+          <w:szCs w:val="22"/>
+        </w:rPr>
+        <w:t xml:space="preserve">Tempoh aktiviti: </w:t>
+      </w:r>
+      <w:r>
+        <w:rPr>
+          <w:highlight w:val="yellow"/>
+          <w:highlightCs w:val="yellow"/>
+        </w:rPr>
+        <w:t xml:space="preserve">[tarikh mula]</w:t>
+      </w:r>
+      <w:r>
+        <w:rPr>
+          <w:sz w:val="22"/>
+          <w:szCs w:val="22"/>
+        </w:rPr>
+        <w:t xml:space="preserve"> hingga </w:t>
+      </w:r>
+      <w:r>
+        <w:rPr>
+          <w:highlight w:val="yellow"/>
+          <w:highlightCs w:val="yellow"/>
+        </w:rPr>
+        <w:t xml:space="preserve">[tarikh tamat]</w:t>
+      </w:r>
+    </w:p>
+    <w:p>
+      <w:pPr>
+        <w:spacing w:after="600"/>
+        <w:jc w:val="center"/>
+      </w:pPr>
+      <w:r>
+        <w:rPr>
+          <w:b/>
+          <w:bCs/>
+          <w:sz w:val="22"/>
+          <w:szCs w:val="22"/>
+        </w:rPr>
+        <w:t xml:space="preserve">Tarikh hantar: </w:t>
+      </w:r>
+      <w:r>
+        <w:rPr>
+          <w:highlight w:val="yellow"/>
+          <w:highlightCs w:val="yellow"/>
+        </w:rPr>
+        <w:t xml:space="preserve">[tarikh]</w:t>
+      </w:r>
+    </w:p>
+    <w:p>
+      <w:pPr>
+        <w:spacing w:after="60"/>
+        <w:jc w:val="center"/>
+      </w:pPr>
+      <w:r>
+        <w:rPr>
+          <w:b/>
+          <w:bCs/>
+          <w:sz w:val="22"/>
+          <w:szCs w:val="22"/>
+        </w:rPr>
+        <w:t xml:space="preserve">FAKULTI SAINS KEMANUSIAAN</w:t>
+      </w:r>
+    </w:p>
+    <w:p>
+      <w:pPr>
+        <w:spacing w:after="0"/>
+        <w:jc w:val="center"/>
+      </w:pPr>
+      <w:r>
+        <w:rPr>
+          <w:b/>
+          <w:bCs/>
+          <w:sz w:val="22"/>
+          <w:szCs w:val="22"/>
+        </w:rPr>
+        <w:t xml:space="preserve">UNIVERSITI PENDIDIKAN SULTAN IDRIS</w:t>
+      </w:r>
+    </w:p>
+    <w:p>
+      <w:pPr>
+        <w:sectPr>
+          <w:pgSz w:w="11906" w:h="16838" w:orient="portrait"/>
+          <w:pgMar w:top="1440" w:right="1440" w:bottom="1440" w:left="1440" w:header="708" w:footer="708" w:gutter="0"/>
+          <w:pgNumType/>
+          <w:docGrid w:linePitch="360"/>
+        </w:sectPr>
+      </w:pPr>
+    </w:p>
+    <w:p>
+      <w:pPr>
+        <w:spacing w:after="240"/>
+        <w:jc w:val="center"/>
+      </w:pPr>
+      <w:r>
+        <w:rPr>
+          <w:b/>
+          <w:bCs/>
+          <w:sz w:val="26"/>
+          <w:szCs w:val="26"/>
+        </w:rPr>
+        <w:t xml:space="preserve">ISI KANDUNGAN</w:t>
+      </w:r>
+    </w:p>
+    <w:sdt>
+      <w:sdtPr>
+        <w:alias w:val="Isi Kandungan"/>
+      </w:sdtPr>
+      <w:sdtContent>
+        <w:p>
+          <w:r>
+            <w:fldChar w:fldCharType="begin" w:dirty="true"/>
+            <w:instrText xml:space="preserve">TOC \h \o "1-2"</w:instrText>
+            <w:fldChar w:fldCharType="separate"/>
+          </w:r>
+        </w:p>
+        <w:p>
+          <w:r>
+            <w:fldChar w:fldCharType="end"/>
+          </w:r>
+        </w:p>
+      </w:sdtContent>
+    </w:sdt>
+    <w:p>
+      <w:r>
+        <w:br w:type="page"/>
+      </w:r>
+    </w:p>
+    <w:p>
+      <w:pPr>
+        <w:pStyle w:val="Heading1"/>
+      </w:pPr>
+      <w:r>
+        <w:t xml:space="preserve">1.0 PENGENALAN</w:t>
+      </w:r>
+    </w:p>
+    <w:p>
+      <w:pPr>
+        <w:spacing w:after="160" w:line="360"/>
+        <w:jc w:val="both"/>
+      </w:pPr>
+      <w:r>
+        <w:t xml:space="preserve">Sepanjang latihan industri di FSKXpert, Fakulti Sains Kemanusiaan, saya telah dipertanggungjawabkan untuk memasarkan koleksi 10 e-book buku mewarna FSKXpert. Pemasaran dijalankan melalui aplikasi WhatsApp dan media sosial.</w:t>
+      </w:r>
+    </w:p>
+    <w:p>
+      <w:pPr>
+        <w:spacing w:after="160" w:line="360"/>
+        <w:jc w:val="both"/>
+      </w:pPr>
+      <w:r>
+        <w:t xml:space="preserve">Laporan ini merekodkan setiap aktiviti pemasaran yang telah saya laksanakan, hasil yang diperoleh serta bukti tangkap layar bagi setiap aktiviti. Laporan ini juga memuatkan masalah yang dihadapi, pengajaran yang diperoleh dan cadangan penambahbaikan.</w:t>
+      </w:r>
+    </w:p>
+    <w:p>
+      <w:pPr>
+        <w:pStyle w:val="Heading1"/>
+      </w:pPr>
+      <w:r>
+        <w:t xml:space="preserve">2.0 OBJEKTIF</w:t>
+      </w:r>
+    </w:p>
+    <w:p>
+      <w:pPr>
+        <w:spacing w:after="160" w:line="360"/>
+        <w:jc w:val="both"/>
+      </w:pPr>
+      <w:r>
+        <w:t xml:space="preserve">Aktiviti pemasaran ini dijalankan untuk:</w:t>
+      </w:r>
+    </w:p>
+    <w:p>
+      <w:pPr>
+        <w:pStyle w:val="ListParagraph"/>
+        <w:numPr>
+          <w:ilvl w:val="0"/>
+          <w:numId w:val="2"/>
+        </w:numPr>
+        <w:spacing w:after="80" w:line="320"/>
+      </w:pPr>
+      <w:r>
+        <w:t xml:space="preserve">Memperkenalkan koleksi e-book buku mewarna FSKXpert kepada ibu bapa, guru dan orang ramai.</w:t>
+      </w:r>
+    </w:p>
+    <w:p>
+      <w:pPr>
+        <w:pStyle w:val="ListParagraph"/>
+        <w:numPr>
+          <w:ilvl w:val="0"/>
+          <w:numId w:val="2"/>
+        </w:numPr>
+        <w:spacing w:after="80" w:line="320"/>
+      </w:pPr>
+      <w:r>
+        <w:t xml:space="preserve">Menjana pertanyaan dan jualan melalui WhatsApp pada harga promosi RM15.</w:t>
+      </w:r>
+    </w:p>
+    <w:p>
+      <w:pPr>
+        <w:pStyle w:val="ListParagraph"/>
+        <w:numPr>
+          <w:ilvl w:val="0"/>
+          <w:numId w:val="2"/>
+        </w:numPr>
+        <w:spacing w:after="80" w:line="320"/>
+      </w:pPr>
+      <w:r>
+        <w:t xml:space="preserve">Menguji keberkesanan WhatsApp dan media sosial sebagai saluran jualan produk digital.</w:t>
+      </w:r>
+    </w:p>
+    <w:p>
+      <w:pPr>
+        <w:pStyle w:val="ListParagraph"/>
+        <w:numPr>
+          <w:ilvl w:val="0"/>
+          <w:numId w:val="2"/>
+        </w:numPr>
+        <w:spacing w:after="80" w:line="320"/>
+      </w:pPr>
+      <w:r>
+        <w:t xml:space="preserve">Membina senarai pelanggan bagi promosi siri akan datang.</w:t>
+      </w:r>
+    </w:p>
+    <w:p>
+      <w:pPr>
+        <w:pStyle w:val="Heading1"/>
+      </w:pPr>
+      <w:r>
+        <w:t xml:space="preserve">3.0 MAKLUMAT PRODUK</w:t>
+      </w:r>
+    </w:p>
+    <w:tbl>
+      <w:tblPr>
+        <w:tblW w:type="dxa" w:w="9026"/>
+        <w:tblBorders>
+          <w:top w:val="single" w:color="auto" w:sz="4"/>
+          <w:left w:val="single" w:color="auto" w:sz="4"/>
+          <w:bottom w:val="single" w:color="auto" w:sz="4"/>
+          <w:right w:val="single" w:color="auto" w:sz="4"/>
+          <w:insideH w:val="single" w:color="auto" w:sz="4"/>
+          <w:insideV w:val="single" w:color="auto" w:sz="4"/>
+        </w:tblBorders>
+      </w:tblPr>
+      <w:tblGrid>
+        <w:gridCol w:w="2600"/>
+        <w:gridCol w:w="6426"/>
+      </w:tblGrid>
+      <w:tr>
+        <w:trPr>
+          <w:tblHeader/>
+        </w:trPr>
+        <w:tc>
+          <w:tcPr>
+            <w:tcW w:type="dxa" w:w="2600"/>
+            <w:tcBorders>
+              <w:top w:val="single" w:color="BFBFBF" w:sz="4"/>
+              <w:left w:val="single" w:color="BFBFBF" w:sz="4"/>
+              <w:bottom w:val="single" w:color="BFBFBF" w:sz="4"/>
+              <w:right w:val="single" w:color="BFBFBF" w:sz="4"/>
+            </w:tcBorders>
+            <w:shd w:fill="DCE6F2" w:color="auto" w:val="clear"/>
+            <w:tcMar>
+              <w:top w:type="dxa" w:w="80"/>
+              <w:left w:type="dxa" w:w="120"/>
+              <w:bottom w:type="dxa" w:w="80"/>
+              <w:right w:type="dxa" w:w="120"/>
+            </w:tcMar>
+          </w:tcPr>
+          <w:p>
+            <w:r>
+              <w:rPr>
+                <w:b/>
+                <w:bCs/>
+                <w:i w:val="false"/>
+                <w:iCs w:val="false"/>
+                <w:sz w:val="20"/>
+                <w:szCs w:val="20"/>
+              </w:rPr>
+              <w:t xml:space="preserve">Perkara</w:t>
+            </w:r>
+          </w:p>
+        </w:tc>
+        <w:tc>
+          <w:tcPr>
+            <w:tcW w:type="dxa" w:w="6426"/>
+            <w:tcBorders>
+              <w:top w:val="single" w:color="BFBFBF" w:sz="4"/>
+              <w:left w:val="single" w:color="BFBFBF" w:sz="4"/>
+              <w:bottom w:val="single" w:color="BFBFBF" w:sz="4"/>
+              <w:right w:val="single" w:color="BFBFBF" w:sz="4"/>
+            </w:tcBorders>
+            <w:shd w:fill="DCE6F2" w:color="auto" w:val="clear"/>
+            <w:tcMar>
+              <w:top w:type="dxa" w:w="80"/>
+              <w:left w:type="dxa" w:w="120"/>
+              <w:bottom w:type="dxa" w:w="80"/>
+              <w:right w:type="dxa" w:w="120"/>
+            </w:tcMar>
+          </w:tcPr>
+          <w:p>
+            <w:r>
+              <w:rPr>
+                <w:b/>
+                <w:bCs/>
+                <w:i w:val="false"/>
+                <w:iCs w:val="false"/>
+                <w:sz w:val="20"/>
+                <w:szCs w:val="20"/>
+              </w:rPr>
+              <w:t xml:space="preserve">Butiran</w:t>
+            </w:r>
+          </w:p>
+        </w:tc>
+      </w:tr>
+      <w:tr>
+        <w:trPr>
+          <w:cantSplit/>
+        </w:trPr>
+        <w:tc>
+          <w:tcPr>
+            <w:tcW w:type="dxa" w:w="2600"/>
+            <w:tcBorders>
+              <w:top w:val="single" w:color="BFBFBF" w:sz="4"/>
+              <w:left w:val="single" w:color="BFBFBF" w:sz="4"/>
+              <w:bottom w:val="single" w:color="BFBFBF" w:sz="4"/>
+              <w:right w:val="single" w:color="BFBFBF" w:sz="4"/>
+            </w:tcBorders>
+            <w:tcMar>
+              <w:top w:type="dxa" w:w="80"/>
+              <w:left w:type="dxa" w:w="120"/>
+              <w:bottom w:type="dxa" w:w="80"/>
+              <w:right w:type="dxa" w:w="120"/>
+            </w:tcMar>
+          </w:tcPr>
+          <w:p>
+            <w:r>
+              <w:rPr>
+                <w:b w:val="false"/>
+                <w:bCs w:val="false"/>
+                <w:sz w:val="20"/>
+                <w:szCs w:val="20"/>
+              </w:rPr>
+              <w:t xml:space="preserve">Nama produk</w:t>
+            </w:r>
+          </w:p>
+        </w:tc>
+        <w:tc>
+          <w:tcPr>
+            <w:tcW w:type="dxa" w:w="6426"/>
+            <w:tcBorders>
+              <w:top w:val="single" w:color="BFBFBF" w:sz="4"/>
+              <w:left w:val="single" w:color="BFBFBF" w:sz="4"/>
+              <w:bottom w:val="single" w:color="BFBFBF" w:sz="4"/>
+              <w:right w:val="single" w:color="BFBFBF" w:sz="4"/>
+            </w:tcBorders>
+            <w:tcMar>
+              <w:top w:type="dxa" w:w="80"/>
+              <w:left w:type="dxa" w:w="120"/>
+              <w:bottom w:type="dxa" w:w="80"/>
+              <w:right w:type="dxa" w:w="120"/>
+            </w:tcMar>
+          </w:tcPr>
+          <w:p>
+            <w:r>
+              <w:rPr>
+                <w:b w:val="false"/>
+                <w:bCs w:val="false"/>
+                <w:sz w:val="20"/>
+                <w:szCs w:val="20"/>
+              </w:rPr>
+              <w:t xml:space="preserve">Koleksi E-Book Buku Mewarna FSKXpert</w:t>
+            </w:r>
+          </w:p>
+        </w:tc>
+      </w:tr>
+      <w:tr>
+        <w:trPr>
+          <w:cantSplit/>
+        </w:trPr>
+        <w:tc>
+          <w:tcPr>
+            <w:tcW w:type="dxa" w:w="2600"/>
+            <w:tcBorders>
+              <w:top w:val="single" w:color="BFBFBF" w:sz="4"/>
+              <w:left w:val="single" w:color="BFBFBF" w:sz="4"/>
+              <w:bottom w:val="single" w:color="BFBFBF" w:sz="4"/>
+              <w:right w:val="single" w:color="BFBFBF" w:sz="4"/>
+            </w:tcBorders>
+            <w:tcMar>
+              <w:top w:type="dxa" w:w="80"/>
+              <w:left w:type="dxa" w:w="120"/>
+              <w:bottom w:type="dxa" w:w="80"/>
+              <w:right w:type="dxa" w:w="120"/>
+            </w:tcMar>
+          </w:tcPr>
+          <w:p>
+            <w:r>
+              <w:rPr>
+                <w:b w:val="false"/>
+                <w:bCs w:val="false"/>
+                <w:sz w:val="20"/>
+                <w:szCs w:val="20"/>
+              </w:rPr>
+              <w:t xml:space="preserve">Kandungan</w:t>
+            </w:r>
+          </w:p>
+        </w:tc>
+        <w:tc>
+          <w:tcPr>
+            <w:tcW w:type="dxa" w:w="6426"/>
+            <w:tcBorders>
+              <w:top w:val="single" w:color="BFBFBF" w:sz="4"/>
+              <w:left w:val="single" w:color="BFBFBF" w:sz="4"/>
+              <w:bottom w:val="single" w:color="BFBFBF" w:sz="4"/>
+              <w:right w:val="single" w:color="BFBFBF" w:sz="4"/>
+            </w:tcBorders>
+            <w:tcMar>
+              <w:top w:type="dxa" w:w="80"/>
+              <w:left w:type="dxa" w:w="120"/>
+              <w:bottom w:type="dxa" w:w="80"/>
+              <w:right w:type="dxa" w:w="120"/>
+            </w:tcMar>
+          </w:tcPr>
+          <w:p>
+            <w:r>
+              <w:rPr>
+                <w:b w:val="false"/>
+                <w:bCs w:val="false"/>
+                <w:sz w:val="20"/>
+                <w:szCs w:val="20"/>
+              </w:rPr>
+              <w:t xml:space="preserve">10 siri buku mewarna, 30 halaman bagi setiap buku</w:t>
+            </w:r>
+          </w:p>
+        </w:tc>
+      </w:tr>
+      <w:tr>
+        <w:trPr>
+          <w:cantSplit/>
+        </w:trPr>
+        <w:tc>
+          <w:tcPr>
+            <w:tcW w:type="dxa" w:w="2600"/>
+            <w:tcBorders>
+              <w:top w:val="single" w:color="BFBFBF" w:sz="4"/>
+              <w:left w:val="single" w:color="BFBFBF" w:sz="4"/>
+              <w:bottom w:val="single" w:color="BFBFBF" w:sz="4"/>
+              <w:right w:val="single" w:color="BFBFBF" w:sz="4"/>
+            </w:tcBorders>
+            <w:tcMar>
+              <w:top w:type="dxa" w:w="80"/>
+              <w:left w:type="dxa" w:w="120"/>
+              <w:bottom w:type="dxa" w:w="80"/>
+              <w:right w:type="dxa" w:w="120"/>
+            </w:tcMar>
+          </w:tcPr>
+          <w:p>
+            <w:r>
+              <w:rPr>
+                <w:b w:val="false"/>
+                <w:bCs w:val="false"/>
+                <w:sz w:val="20"/>
+                <w:szCs w:val="20"/>
+              </w:rPr>
+              <w:t xml:space="preserve">Format</w:t>
+            </w:r>
+          </w:p>
+        </w:tc>
+        <w:tc>
+          <w:tcPr>
+            <w:tcW w:type="dxa" w:w="6426"/>
+            <w:tcBorders>
+              <w:top w:val="single" w:color="BFBFBF" w:sz="4"/>
+              <w:left w:val="single" w:color="BFBFBF" w:sz="4"/>
+              <w:bottom w:val="single" w:color="BFBFBF" w:sz="4"/>
+              <w:right w:val="single" w:color="BFBFBF" w:sz="4"/>
+            </w:tcBorders>
+            <w:tcMar>
+              <w:top w:type="dxa" w:w="80"/>
+              <w:left w:type="dxa" w:w="120"/>
+              <w:bottom w:type="dxa" w:w="80"/>
+              <w:right w:type="dxa" w:w="120"/>
+            </w:tcMar>
+          </w:tcPr>
+          <w:p>
+            <w:r>
+              <w:rPr>
+                <w:b w:val="false"/>
+                <w:bCs w:val="false"/>
+                <w:sz w:val="20"/>
+                <w:szCs w:val="20"/>
+              </w:rPr>
+              <w:t xml:space="preserve">PDF saiz A4, 300 DPI, boleh dicetak berulang kali</w:t>
+            </w:r>
+          </w:p>
+        </w:tc>
+      </w:tr>
+      <w:tr>
+        <w:trPr>
+          <w:cantSplit/>
+        </w:trPr>
+        <w:tc>
+          <w:tcPr>
+            <w:tcW w:type="dxa" w:w="2600"/>
+            <w:tcBorders>
+              <w:top w:val="single" w:color="BFBFBF" w:sz="4"/>
+              <w:left w:val="single" w:color="BFBFBF" w:sz="4"/>
+              <w:bottom w:val="single" w:color="BFBFBF" w:sz="4"/>
+              <w:right w:val="single" w:color="BFBFBF" w:sz="4"/>
+            </w:tcBorders>
+            <w:tcMar>
+              <w:top w:type="dxa" w:w="80"/>
+              <w:left w:type="dxa" w:w="120"/>
+              <w:bottom w:type="dxa" w:w="80"/>
+              <w:right w:type="dxa" w:w="120"/>
+            </w:tcMar>
+          </w:tcPr>
+          <w:p>
+            <w:r>
+              <w:rPr>
+                <w:b w:val="false"/>
+                <w:bCs w:val="false"/>
+                <w:sz w:val="20"/>
+                <w:szCs w:val="20"/>
+              </w:rPr>
+              <w:t xml:space="preserve">Sasaran</w:t>
+            </w:r>
+          </w:p>
+        </w:tc>
+        <w:tc>
+          <w:tcPr>
+            <w:tcW w:type="dxa" w:w="6426"/>
+            <w:tcBorders>
+              <w:top w:val="single" w:color="BFBFBF" w:sz="4"/>
+              <w:left w:val="single" w:color="BFBFBF" w:sz="4"/>
+              <w:bottom w:val="single" w:color="BFBFBF" w:sz="4"/>
+              <w:right w:val="single" w:color="BFBFBF" w:sz="4"/>
+            </w:tcBorders>
+            <w:tcMar>
+              <w:top w:type="dxa" w:w="80"/>
+              <w:left w:type="dxa" w:w="120"/>
+              <w:bottom w:type="dxa" w:w="80"/>
+              <w:right w:type="dxa" w:w="120"/>
+            </w:tcMar>
+          </w:tcPr>
+          <w:p>
+            <w:r>
+              <w:rPr>
+                <w:b w:val="false"/>
+                <w:bCs w:val="false"/>
+                <w:sz w:val="20"/>
+                <w:szCs w:val="20"/>
+              </w:rPr>
+              <w:t xml:space="preserve">Kanak-kanak prasekolah dan sekolah rendah</w:t>
+            </w:r>
+          </w:p>
+        </w:tc>
+      </w:tr>
+      <w:tr>
+        <w:trPr>
+          <w:cantSplit/>
+        </w:trPr>
+        <w:tc>
+          <w:tcPr>
+            <w:tcW w:type="dxa" w:w="2600"/>
+            <w:tcBorders>
+              <w:top w:val="single" w:color="BFBFBF" w:sz="4"/>
+              <w:left w:val="single" w:color="BFBFBF" w:sz="4"/>
+              <w:bottom w:val="single" w:color="BFBFBF" w:sz="4"/>
+              <w:right w:val="single" w:color="BFBFBF" w:sz="4"/>
+            </w:tcBorders>
+            <w:tcMar>
+              <w:top w:type="dxa" w:w="80"/>
+              <w:left w:type="dxa" w:w="120"/>
+              <w:bottom w:type="dxa" w:w="80"/>
+              <w:right w:type="dxa" w:w="120"/>
+            </w:tcMar>
+          </w:tcPr>
+          <w:p>
+            <w:r>
+              <w:rPr>
+                <w:b w:val="false"/>
+                <w:bCs w:val="false"/>
+                <w:sz w:val="20"/>
+                <w:szCs w:val="20"/>
+              </w:rPr>
+              <w:t xml:space="preserve">Harga</w:t>
+            </w:r>
+          </w:p>
+        </w:tc>
+        <w:tc>
+          <w:tcPr>
+            <w:tcW w:type="dxa" w:w="6426"/>
+            <w:tcBorders>
+              <w:top w:val="single" w:color="BFBFBF" w:sz="4"/>
+              <w:left w:val="single" w:color="BFBFBF" w:sz="4"/>
+              <w:bottom w:val="single" w:color="BFBFBF" w:sz="4"/>
+              <w:right w:val="single" w:color="BFBFBF" w:sz="4"/>
+            </w:tcBorders>
+            <w:tcMar>
+              <w:top w:type="dxa" w:w="80"/>
+              <w:left w:type="dxa" w:w="120"/>
+              <w:bottom w:type="dxa" w:w="80"/>
+              <w:right w:type="dxa" w:w="120"/>
+            </w:tcMar>
+          </w:tcPr>
+          <w:p>
+            <w:r>
+              <w:rPr>
+                <w:b w:val="false"/>
+                <w:bCs w:val="false"/>
+                <w:sz w:val="20"/>
+                <w:szCs w:val="20"/>
+              </w:rPr>
+              <w:t xml:space="preserve">RM20, harga promosi RM15</w:t>
+            </w:r>
+          </w:p>
+        </w:tc>
+      </w:tr>
+      <w:tr>
+        <w:trPr>
+          <w:cantSplit/>
+        </w:trPr>
+        <w:tc>
+          <w:tcPr>
+            <w:tcW w:type="dxa" w:w="2600"/>
+            <w:tcBorders>
+              <w:top w:val="single" w:color="BFBFBF" w:sz="4"/>
+              <w:left w:val="single" w:color="BFBFBF" w:sz="4"/>
+              <w:bottom w:val="single" w:color="BFBFBF" w:sz="4"/>
+              <w:right w:val="single" w:color="BFBFBF" w:sz="4"/>
+            </w:tcBorders>
+            <w:tcMar>
+              <w:top w:type="dxa" w:w="80"/>
+              <w:left w:type="dxa" w:w="120"/>
+              <w:bottom w:type="dxa" w:w="80"/>
+              <w:right w:type="dxa" w:w="120"/>
+            </w:tcMar>
+          </w:tcPr>
+          <w:p>
+            <w:r>
+              <w:rPr>
+                <w:b w:val="false"/>
+                <w:bCs w:val="false"/>
+                <w:sz w:val="20"/>
+                <w:szCs w:val="20"/>
+              </w:rPr>
+              <w:t xml:space="preserve">Tawaran</w:t>
+            </w:r>
+          </w:p>
+        </w:tc>
+        <w:tc>
+          <w:tcPr>
+            <w:tcW w:type="dxa" w:w="6426"/>
+            <w:tcBorders>
+              <w:top w:val="single" w:color="BFBFBF" w:sz="4"/>
+              <w:left w:val="single" w:color="BFBFBF" w:sz="4"/>
+              <w:bottom w:val="single" w:color="BFBFBF" w:sz="4"/>
+              <w:right w:val="single" w:color="BFBFBF" w:sz="4"/>
+            </w:tcBorders>
+            <w:tcMar>
+              <w:top w:type="dxa" w:w="80"/>
+              <w:left w:type="dxa" w:w="120"/>
+              <w:bottom w:type="dxa" w:w="80"/>
+              <w:right w:type="dxa" w:w="120"/>
+            </w:tcMar>
+          </w:tcPr>
+          <w:p>
+            <w:r>
+              <w:rPr>
+                <w:b w:val="false"/>
+                <w:bCs w:val="false"/>
+                <w:sz w:val="20"/>
+                <w:szCs w:val="20"/>
+              </w:rPr>
+              <w:t xml:space="preserve">9 set buku + 1 buku percuma</w:t>
+            </w:r>
+          </w:p>
+        </w:tc>
+      </w:tr>
+      <w:tr>
+        <w:trPr>
+          <w:cantSplit/>
+        </w:trPr>
+        <w:tc>
+          <w:tcPr>
+            <w:tcW w:type="dxa" w:w="2600"/>
+            <w:tcBorders>
+              <w:top w:val="single" w:color="BFBFBF" w:sz="4"/>
+              <w:left w:val="single" w:color="BFBFBF" w:sz="4"/>
+              <w:bottom w:val="single" w:color="BFBFBF" w:sz="4"/>
+              <w:right w:val="single" w:color="BFBFBF" w:sz="4"/>
+            </w:tcBorders>
+            <w:tcMar>
+              <w:top w:type="dxa" w:w="80"/>
+              <w:left w:type="dxa" w:w="120"/>
+              <w:bottom w:type="dxa" w:w="80"/>
+              <w:right w:type="dxa" w:w="120"/>
+            </w:tcMar>
+          </w:tcPr>
+          <w:p>
+            <w:r>
+              <w:rPr>
+                <w:b w:val="false"/>
+                <w:bCs w:val="false"/>
+                <w:sz w:val="20"/>
+                <w:szCs w:val="20"/>
+              </w:rPr>
+              <w:t xml:space="preserve">Saluran jualan</w:t>
+            </w:r>
+          </w:p>
+        </w:tc>
+        <w:tc>
+          <w:tcPr>
+            <w:tcW w:type="dxa" w:w="6426"/>
+            <w:tcBorders>
+              <w:top w:val="single" w:color="BFBFBF" w:sz="4"/>
+              <w:left w:val="single" w:color="BFBFBF" w:sz="4"/>
+              <w:bottom w:val="single" w:color="BFBFBF" w:sz="4"/>
+              <w:right w:val="single" w:color="BFBFBF" w:sz="4"/>
+            </w:tcBorders>
+            <w:tcMar>
+              <w:top w:type="dxa" w:w="80"/>
+              <w:left w:type="dxa" w:w="120"/>
+              <w:bottom w:type="dxa" w:w="80"/>
+              <w:right w:type="dxa" w:w="120"/>
+            </w:tcMar>
+          </w:tcPr>
+          <w:p>
+            <w:r>
+              <w:rPr>
+                <w:b w:val="false"/>
+                <w:bCs w:val="false"/>
+                <w:sz w:val="20"/>
+                <w:szCs w:val="20"/>
+              </w:rPr>
+              <w:t xml:space="preserve">WhatsApp 010-263 7597 (Cik Nia)</w:t>
+            </w:r>
+          </w:p>
+        </w:tc>
+      </w:tr>
+    </w:tbl>
+    <w:p>
+      <w:pPr>
+        <w:pStyle w:val="Heading1"/>
+      </w:pPr>
+      <w:r>
+        <w:t xml:space="preserve">4.0 SKOP DAN TEMPOH AKTIVITI</w:t>
+      </w:r>
+    </w:p>
+    <w:tbl>
+      <w:tblPr>
+        <w:tblW w:type="dxa" w:w="9026"/>
+        <w:tblBorders>
+          <w:top w:val="single" w:color="auto" w:sz="4"/>
+          <w:left w:val="single" w:color="auto" w:sz="4"/>
+          <w:bottom w:val="single" w:color="auto" w:sz="4"/>
+          <w:right w:val="single" w:color="auto" w:sz="4"/>
+          <w:insideH w:val="single" w:color="auto" w:sz="4"/>
+          <w:insideV w:val="single" w:color="auto" w:sz="4"/>
+        </w:tblBorders>
+      </w:tblPr>
+      <w:tblGrid>
+        <w:gridCol w:w="2600"/>
+        <w:gridCol w:w="6426"/>
+      </w:tblGrid>
+      <w:tr>
+        <w:trPr>
+          <w:tblHeader/>
+        </w:trPr>
+        <w:tc>
+          <w:tcPr>
+            <w:tcW w:type="dxa" w:w="2600"/>
+            <w:tcBorders>
+              <w:top w:val="single" w:color="BFBFBF" w:sz="4"/>
+              <w:left w:val="single" w:color="BFBFBF" w:sz="4"/>
+              <w:bottom w:val="single" w:color="BFBFBF" w:sz="4"/>
+              <w:right w:val="single" w:color="BFBFBF" w:sz="4"/>
+            </w:tcBorders>
+            <w:shd w:fill="DCE6F2" w:color="auto" w:val="clear"/>
+            <w:tcMar>
+              <w:top w:type="dxa" w:w="80"/>
+              <w:left w:type="dxa" w:w="120"/>
+              <w:bottom w:type="dxa" w:w="80"/>
+              <w:right w:type="dxa" w:w="120"/>
+            </w:tcMar>
+          </w:tcPr>
+          <w:p>
+            <w:r>
+              <w:rPr>
+                <w:b/>
+                <w:bCs/>
+                <w:i w:val="false"/>
+                <w:iCs w:val="false"/>
+                <w:sz w:val="20"/>
+                <w:szCs w:val="20"/>
+              </w:rPr>
+              <w:t xml:space="preserve">Perkara</w:t>
+            </w:r>
+          </w:p>
+        </w:tc>
+        <w:tc>
+          <w:tcPr>
+            <w:tcW w:type="dxa" w:w="6426"/>
+            <w:tcBorders>
+              <w:top w:val="single" w:color="BFBFBF" w:sz="4"/>
+              <w:left w:val="single" w:color="BFBFBF" w:sz="4"/>
+              <w:bottom w:val="single" w:color="BFBFBF" w:sz="4"/>
+              <w:right w:val="single" w:color="BFBFBF" w:sz="4"/>
+            </w:tcBorders>
+            <w:shd w:fill="DCE6F2" w:color="auto" w:val="clear"/>
+            <w:tcMar>
+              <w:top w:type="dxa" w:w="80"/>
+              <w:left w:type="dxa" w:w="120"/>
+              <w:bottom w:type="dxa" w:w="80"/>
+              <w:right w:type="dxa" w:w="120"/>
+            </w:tcMar>
+          </w:tcPr>
+          <w:p>
+            <w:r>
+              <w:rPr>
+                <w:b/>
+                <w:bCs/>
+                <w:i w:val="false"/>
+                <w:iCs w:val="false"/>
+                <w:sz w:val="20"/>
+                <w:szCs w:val="20"/>
+              </w:rPr>
+              <w:t xml:space="preserve">Butiran</w:t>
+            </w:r>
+          </w:p>
+        </w:tc>
+      </w:tr>
+      <w:tr>
+        <w:trPr>
+          <w:cantSplit/>
+        </w:trPr>
+        <w:tc>
+          <w:tcPr>
+            <w:tcW w:type="dxa" w:w="2600"/>
+            <w:tcBorders>
+              <w:top w:val="single" w:color="BFBFBF" w:sz="4"/>
+              <w:left w:val="single" w:color="BFBFBF" w:sz="4"/>
+              <w:bottom w:val="single" w:color="BFBFBF" w:sz="4"/>
+              <w:right w:val="single" w:color="BFBFBF" w:sz="4"/>
+            </w:tcBorders>
+            <w:tcMar>
+              <w:top w:type="dxa" w:w="80"/>
+              <w:left w:type="dxa" w:w="120"/>
+              <w:bottom w:type="dxa" w:w="80"/>
+              <w:right w:type="dxa" w:w="120"/>
+            </w:tcMar>
+          </w:tcPr>
+          <w:p>
+            <w:r>
+              <w:rPr>
+                <w:b w:val="false"/>
+                <w:bCs w:val="false"/>
+                <w:sz w:val="20"/>
+                <w:szCs w:val="20"/>
+              </w:rPr>
+              <w:t xml:space="preserve">Tempoh</w:t>
+            </w:r>
+          </w:p>
+        </w:tc>
+        <w:tc>
+          <w:tcPr>
+            <w:tcW w:type="dxa" w:w="6426"/>
+            <w:tcBorders>
+              <w:top w:val="single" w:color="BFBFBF" w:sz="4"/>
+              <w:left w:val="single" w:color="BFBFBF" w:sz="4"/>
+              <w:bottom w:val="single" w:color="BFBFBF" w:sz="4"/>
+              <w:right w:val="single" w:color="BFBFBF" w:sz="4"/>
+            </w:tcBorders>
+            <w:tcMar>
+              <w:top w:type="dxa" w:w="80"/>
+              <w:left w:type="dxa" w:w="120"/>
+              <w:bottom w:type="dxa" w:w="80"/>
+              <w:right w:type="dxa" w:w="120"/>
+            </w:tcMar>
+          </w:tcPr>
+          <w:p>
+            <w:r>
+              <w:rPr>
+                <w:highlight w:val="yellow"/>
+                <w:highlightCs w:val="yellow"/>
+              </w:rPr>
+              <w:t xml:space="preserve">[tarikh mula] hingga [tarikh tamat]</w:t>
+            </w:r>
+          </w:p>
+        </w:tc>
+      </w:tr>
+      <w:tr>
+        <w:trPr>
+          <w:cantSplit/>
+        </w:trPr>
+        <w:tc>
+          <w:tcPr>
+            <w:tcW w:type="dxa" w:w="2600"/>
+            <w:tcBorders>
+              <w:top w:val="single" w:color="BFBFBF" w:sz="4"/>
+              <w:left w:val="single" w:color="BFBFBF" w:sz="4"/>
+              <w:bottom w:val="single" w:color="BFBFBF" w:sz="4"/>
+              <w:right w:val="single" w:color="BFBFBF" w:sz="4"/>
+            </w:tcBorders>
+            <w:tcMar>
+              <w:top w:type="dxa" w:w="80"/>
+              <w:left w:type="dxa" w:w="120"/>
+              <w:bottom w:type="dxa" w:w="80"/>
+              <w:right w:type="dxa" w:w="120"/>
+            </w:tcMar>
+          </w:tcPr>
+          <w:p>
+            <w:r>
+              <w:rPr>
+                <w:b w:val="false"/>
+                <w:bCs w:val="false"/>
+                <w:sz w:val="20"/>
+                <w:szCs w:val="20"/>
+              </w:rPr>
+              <w:t xml:space="preserve">Platform utama</w:t>
+            </w:r>
+          </w:p>
+        </w:tc>
+        <w:tc>
+          <w:tcPr>
+            <w:tcW w:type="dxa" w:w="6426"/>
+            <w:tcBorders>
+              <w:top w:val="single" w:color="BFBFBF" w:sz="4"/>
+              <w:left w:val="single" w:color="BFBFBF" w:sz="4"/>
+              <w:bottom w:val="single" w:color="BFBFBF" w:sz="4"/>
+              <w:right w:val="single" w:color="BFBFBF" w:sz="4"/>
+            </w:tcBorders>
+            <w:tcMar>
+              <w:top w:type="dxa" w:w="80"/>
+              <w:left w:type="dxa" w:w="120"/>
+              <w:bottom w:type="dxa" w:w="80"/>
+              <w:right w:type="dxa" w:w="120"/>
+            </w:tcMar>
+          </w:tcPr>
+          <w:p>
+            <w:r>
+              <w:rPr>
+                <w:b w:val="false"/>
+                <w:bCs w:val="false"/>
+                <w:sz w:val="20"/>
+                <w:szCs w:val="20"/>
+              </w:rPr>
+              <w:t xml:space="preserve">WhatsApp Business: Status, senarai siaran, kumpulan, mesej automatik</w:t>
+            </w:r>
+          </w:p>
+        </w:tc>
+      </w:tr>
+      <w:tr>
+        <w:trPr>
+          <w:cantSplit/>
+        </w:trPr>
+        <w:tc>
+          <w:tcPr>
+            <w:tcW w:type="dxa" w:w="2600"/>
+            <w:tcBorders>
+              <w:top w:val="single" w:color="BFBFBF" w:sz="4"/>
+              <w:left w:val="single" w:color="BFBFBF" w:sz="4"/>
+              <w:bottom w:val="single" w:color="BFBFBF" w:sz="4"/>
+              <w:right w:val="single" w:color="BFBFBF" w:sz="4"/>
+            </w:tcBorders>
+            <w:tcMar>
+              <w:top w:type="dxa" w:w="80"/>
+              <w:left w:type="dxa" w:w="120"/>
+              <w:bottom w:type="dxa" w:w="80"/>
+              <w:right w:type="dxa" w:w="120"/>
+            </w:tcMar>
+          </w:tcPr>
+          <w:p>
+            <w:r>
+              <w:rPr>
+                <w:b w:val="false"/>
+                <w:bCs w:val="false"/>
+                <w:sz w:val="20"/>
+                <w:szCs w:val="20"/>
+              </w:rPr>
+              <w:t xml:space="preserve">Platform sokongan</w:t>
+            </w:r>
+          </w:p>
+        </w:tc>
+        <w:tc>
+          <w:tcPr>
+            <w:tcW w:type="dxa" w:w="6426"/>
+            <w:tcBorders>
+              <w:top w:val="single" w:color="BFBFBF" w:sz="4"/>
+              <w:left w:val="single" w:color="BFBFBF" w:sz="4"/>
+              <w:bottom w:val="single" w:color="BFBFBF" w:sz="4"/>
+              <w:right w:val="single" w:color="BFBFBF" w:sz="4"/>
+            </w:tcBorders>
+            <w:tcMar>
+              <w:top w:type="dxa" w:w="80"/>
+              <w:left w:type="dxa" w:w="120"/>
+              <w:bottom w:type="dxa" w:w="80"/>
+              <w:right w:type="dxa" w:w="120"/>
+            </w:tcMar>
+          </w:tcPr>
+          <w:p>
+            <w:r>
+              <w:rPr>
+                <w:highlight w:val="yellow"/>
+                <w:highlightCs w:val="yellow"/>
+              </w:rPr>
+              <w:t xml:space="preserve">[TikTok / Instagram / Facebook: padam yang tidak berkenaan]</w:t>
+            </w:r>
+          </w:p>
+        </w:tc>
+      </w:tr>
+      <w:tr>
+        <w:trPr>
+          <w:cantSplit/>
+        </w:trPr>
+        <w:tc>
+          <w:tcPr>
+            <w:tcW w:type="dxa" w:w="2600"/>
+            <w:tcBorders>
+              <w:top w:val="single" w:color="BFBFBF" w:sz="4"/>
+              <w:left w:val="single" w:color="BFBFBF" w:sz="4"/>
+              <w:bottom w:val="single" w:color="BFBFBF" w:sz="4"/>
+              <w:right w:val="single" w:color="BFBFBF" w:sz="4"/>
+            </w:tcBorders>
+            <w:tcMar>
+              <w:top w:type="dxa" w:w="80"/>
+              <w:left w:type="dxa" w:w="120"/>
+              <w:bottom w:type="dxa" w:w="80"/>
+              <w:right w:type="dxa" w:w="120"/>
+            </w:tcMar>
+          </w:tcPr>
+          <w:p>
+            <w:r>
+              <w:rPr>
+                <w:b w:val="false"/>
+                <w:bCs w:val="false"/>
+                <w:sz w:val="20"/>
+                <w:szCs w:val="20"/>
+              </w:rPr>
+              <w:t xml:space="preserve">Sasaran pasaran</w:t>
+            </w:r>
+          </w:p>
+        </w:tc>
+        <w:tc>
+          <w:tcPr>
+            <w:tcW w:type="dxa" w:w="6426"/>
+            <w:tcBorders>
+              <w:top w:val="single" w:color="BFBFBF" w:sz="4"/>
+              <w:left w:val="single" w:color="BFBFBF" w:sz="4"/>
+              <w:bottom w:val="single" w:color="BFBFBF" w:sz="4"/>
+              <w:right w:val="single" w:color="BFBFBF" w:sz="4"/>
+            </w:tcBorders>
+            <w:tcMar>
+              <w:top w:type="dxa" w:w="80"/>
+              <w:left w:type="dxa" w:w="120"/>
+              <w:bottom w:type="dxa" w:w="80"/>
+              <w:right w:type="dxa" w:w="120"/>
+            </w:tcMar>
+          </w:tcPr>
+          <w:p>
+            <w:r>
+              <w:rPr>
+                <w:b w:val="false"/>
+                <w:bCs w:val="false"/>
+                <w:sz w:val="20"/>
+                <w:szCs w:val="20"/>
+              </w:rPr>
+              <w:t xml:space="preserve">Ibu bapa, guru prasekolah, pengusaha tadika dan taska</w:t>
+            </w:r>
+          </w:p>
+        </w:tc>
+      </w:tr>
+    </w:tbl>
+    <w:p>
+      <w:pPr>
+        <w:pStyle w:val="Heading1"/>
+      </w:pPr>
+      <w:r>
+        <w:t xml:space="preserve">5.0 AKTIVITI PEMASARAN YANG DIJALANKAN</w:t>
+      </w:r>
+    </w:p>
+    <w:p>
+      <w:pPr>
+        <w:pStyle w:val="Heading2"/>
+      </w:pPr>
+      <w:r>
+        <w:t xml:space="preserve">5.1 Penyediaan Bahan Promosi</w:t>
+      </w:r>
+    </w:p>
+    <w:p>
+      <w:pPr>
+        <w:spacing w:after="160" w:line="360"/>
+        <w:jc w:val="both"/>
+      </w:pPr>
+      <w:r>
+        <w:t xml:space="preserve">Saya telah menyediakan bahan promosi berikut sebelum kempen dimulakan:</w:t>
+      </w:r>
+    </w:p>
+    <w:tbl>
+      <w:tblPr>
+        <w:tblW w:type="dxa" w:w="9026"/>
+        <w:tblBorders>
+          <w:top w:val="single" w:color="auto" w:sz="4"/>
+          <w:left w:val="single" w:color="auto" w:sz="4"/>
+          <w:bottom w:val="single" w:color="auto" w:sz="4"/>
+          <w:right w:val="single" w:color="auto" w:sz="4"/>
+          <w:insideH w:val="single" w:color="auto" w:sz="4"/>
+          <w:insideV w:val="single" w:color="auto" w:sz="4"/>
+        </w:tblBorders>
+      </w:tblPr>
+      <w:tblGrid>
+        <w:gridCol w:w="2200"/>
+        <w:gridCol w:w="4426"/>
+        <w:gridCol w:w="2400"/>
+      </w:tblGrid>
+      <w:tr>
+        <w:trPr>
+          <w:tblHeader/>
+        </w:trPr>
+        <w:tc>
+          <w:tcPr>
+            <w:tcW w:type="dxa" w:w="2200"/>
+            <w:tcBorders>
+              <w:top w:val="single" w:color="BFBFBF" w:sz="4"/>
+              <w:left w:val="single" w:color="BFBFBF" w:sz="4"/>
+              <w:bottom w:val="single" w:color="BFBFBF" w:sz="4"/>
+              <w:right w:val="single" w:color="BFBFBF" w:sz="4"/>
+            </w:tcBorders>
+            <w:shd w:fill="DCE6F2" w:color="auto" w:val="clear"/>
+            <w:tcMar>
+              <w:top w:type="dxa" w:w="80"/>
+              <w:left w:type="dxa" w:w="120"/>
+              <w:bottom w:type="dxa" w:w="80"/>
+              <w:right w:type="dxa" w:w="120"/>
+            </w:tcMar>
+          </w:tcPr>
+          <w:p>
+            <w:r>
+              <w:rPr>
+                <w:b/>
+                <w:bCs/>
+                <w:i w:val="false"/>
+                <w:iCs w:val="false"/>
+                <w:sz w:val="20"/>
+                <w:szCs w:val="20"/>
+              </w:rPr>
+              <w:t xml:space="preserve">Bahan</w:t>
+            </w:r>
+          </w:p>
+        </w:tc>
+        <w:tc>
+          <w:tcPr>
+            <w:tcW w:type="dxa" w:w="4426"/>
+            <w:tcBorders>
+              <w:top w:val="single" w:color="BFBFBF" w:sz="4"/>
+              <w:left w:val="single" w:color="BFBFBF" w:sz="4"/>
+              <w:bottom w:val="single" w:color="BFBFBF" w:sz="4"/>
+              <w:right w:val="single" w:color="BFBFBF" w:sz="4"/>
+            </w:tcBorders>
+            <w:shd w:fill="DCE6F2" w:color="auto" w:val="clear"/>
+            <w:tcMar>
+              <w:top w:type="dxa" w:w="80"/>
+              <w:left w:type="dxa" w:w="120"/>
+              <w:bottom w:type="dxa" w:w="80"/>
+              <w:right w:type="dxa" w:w="120"/>
+            </w:tcMar>
+          </w:tcPr>
+          <w:p>
+            <w:r>
+              <w:rPr>
+                <w:b/>
+                <w:bCs/>
+                <w:i w:val="false"/>
+                <w:iCs w:val="false"/>
+                <w:sz w:val="20"/>
+                <w:szCs w:val="20"/>
+              </w:rPr>
+              <w:t xml:space="preserve">Penerangan</w:t>
+            </w:r>
+          </w:p>
+        </w:tc>
+        <w:tc>
+          <w:tcPr>
+            <w:tcW w:type="dxa" w:w="2400"/>
+            <w:tcBorders>
+              <w:top w:val="single" w:color="BFBFBF" w:sz="4"/>
+              <w:left w:val="single" w:color="BFBFBF" w:sz="4"/>
+              <w:bottom w:val="single" w:color="BFBFBF" w:sz="4"/>
+              <w:right w:val="single" w:color="BFBFBF" w:sz="4"/>
+            </w:tcBorders>
+            <w:shd w:fill="DCE6F2" w:color="auto" w:val="clear"/>
+            <w:tcMar>
+              <w:top w:type="dxa" w:w="80"/>
+              <w:left w:type="dxa" w:w="120"/>
+              <w:bottom w:type="dxa" w:w="80"/>
+              <w:right w:type="dxa" w:w="120"/>
+            </w:tcMar>
+          </w:tcPr>
+          <w:p>
+            <w:r>
+              <w:rPr>
+                <w:b/>
+                <w:bCs/>
+                <w:i w:val="false"/>
+                <w:iCs w:val="false"/>
+                <w:sz w:val="20"/>
+                <w:szCs w:val="20"/>
+              </w:rPr>
+              <w:t xml:space="preserve">Platform</w:t>
+            </w:r>
+          </w:p>
+        </w:tc>
+      </w:tr>
+      <w:tr>
+        <w:trPr>
+          <w:cantSplit/>
+        </w:trPr>
+        <w:tc>
+          <w:tcPr>
+            <w:tcW w:type="dxa" w:w="2200"/>
+            <w:tcBorders>
+              <w:top w:val="single" w:color="BFBFBF" w:sz="4"/>
+              <w:left w:val="single" w:color="BFBFBF" w:sz="4"/>
+              <w:bottom w:val="single" w:color="BFBFBF" w:sz="4"/>
+              <w:right w:val="single" w:color="BFBFBF" w:sz="4"/>
+            </w:tcBorders>
+            <w:tcMar>
+              <w:top w:type="dxa" w:w="80"/>
+              <w:left w:type="dxa" w:w="120"/>
+              <w:bottom w:type="dxa" w:w="80"/>
+              <w:right w:type="dxa" w:w="120"/>
+            </w:tcMar>
+          </w:tcPr>
+          <w:p>
+            <w:r>
+              <w:rPr>
+                <w:b w:val="false"/>
+                <w:bCs w:val="false"/>
+                <w:sz w:val="20"/>
+                <w:szCs w:val="20"/>
+              </w:rPr>
+              <w:t xml:space="preserve">Poster jualan</w:t>
+            </w:r>
+          </w:p>
+        </w:tc>
+        <w:tc>
+          <w:tcPr>
+            <w:tcW w:type="dxa" w:w="4426"/>
+            <w:tcBorders>
+              <w:top w:val="single" w:color="BFBFBF" w:sz="4"/>
+              <w:left w:val="single" w:color="BFBFBF" w:sz="4"/>
+              <w:bottom w:val="single" w:color="BFBFBF" w:sz="4"/>
+              <w:right w:val="single" w:color="BFBFBF" w:sz="4"/>
+            </w:tcBorders>
+            <w:tcMar>
+              <w:top w:type="dxa" w:w="80"/>
+              <w:left w:type="dxa" w:w="120"/>
+              <w:bottom w:type="dxa" w:w="80"/>
+              <w:right w:type="dxa" w:w="120"/>
+            </w:tcMar>
+          </w:tcPr>
+          <w:p>
+            <w:r>
+              <w:rPr>
+                <w:b w:val="false"/>
+                <w:bCs w:val="false"/>
+                <w:sz w:val="20"/>
+                <w:szCs w:val="20"/>
+              </w:rPr>
+              <w:t xml:space="preserve">Poster 2160 x 2700 piksel yang memaparkan 10 kulit buku, harga dan nombor WhatsApp</w:t>
+            </w:r>
+          </w:p>
+        </w:tc>
+        <w:tc>
+          <w:tcPr>
+            <w:tcW w:type="dxa" w:w="2400"/>
+            <w:tcBorders>
+              <w:top w:val="single" w:color="BFBFBF" w:sz="4"/>
+              <w:left w:val="single" w:color="BFBFBF" w:sz="4"/>
+              <w:bottom w:val="single" w:color="BFBFBF" w:sz="4"/>
+              <w:right w:val="single" w:color="BFBFBF" w:sz="4"/>
+            </w:tcBorders>
+            <w:tcMar>
+              <w:top w:type="dxa" w:w="80"/>
+              <w:left w:type="dxa" w:w="120"/>
+              <w:bottom w:type="dxa" w:w="80"/>
+              <w:right w:type="dxa" w:w="120"/>
+            </w:tcMar>
+          </w:tcPr>
+          <w:p>
+            <w:r>
+              <w:rPr>
+                <w:b w:val="false"/>
+                <w:bCs w:val="false"/>
+                <w:sz w:val="20"/>
+                <w:szCs w:val="20"/>
+              </w:rPr>
+              <w:t xml:space="preserve">Status WhatsApp, kumpulan, media sosial</w:t>
+            </w:r>
+          </w:p>
+        </w:tc>
+      </w:tr>
+      <w:tr>
+        <w:trPr>
+          <w:cantSplit/>
+        </w:trPr>
+        <w:tc>
+          <w:tcPr>
+            <w:tcW w:type="dxa" w:w="2200"/>
+            <w:tcBorders>
+              <w:top w:val="single" w:color="BFBFBF" w:sz="4"/>
+              <w:left w:val="single" w:color="BFBFBF" w:sz="4"/>
+              <w:bottom w:val="single" w:color="BFBFBF" w:sz="4"/>
+              <w:right w:val="single" w:color="BFBFBF" w:sz="4"/>
+            </w:tcBorders>
+            <w:tcMar>
+              <w:top w:type="dxa" w:w="80"/>
+              <w:left w:type="dxa" w:w="120"/>
+              <w:bottom w:type="dxa" w:w="80"/>
+              <w:right w:type="dxa" w:w="120"/>
+            </w:tcMar>
+          </w:tcPr>
+          <w:p>
+            <w:r>
+              <w:rPr>
+                <w:b w:val="false"/>
+                <w:bCs w:val="false"/>
+                <w:sz w:val="20"/>
+                <w:szCs w:val="20"/>
+              </w:rPr>
+              <w:t xml:space="preserve">Video promosi</w:t>
+            </w:r>
+          </w:p>
+        </w:tc>
+        <w:tc>
+          <w:tcPr>
+            <w:tcW w:type="dxa" w:w="4426"/>
+            <w:tcBorders>
+              <w:top w:val="single" w:color="BFBFBF" w:sz="4"/>
+              <w:left w:val="single" w:color="BFBFBF" w:sz="4"/>
+              <w:bottom w:val="single" w:color="BFBFBF" w:sz="4"/>
+              <w:right w:val="single" w:color="BFBFBF" w:sz="4"/>
+            </w:tcBorders>
+            <w:tcMar>
+              <w:top w:type="dxa" w:w="80"/>
+              <w:left w:type="dxa" w:w="120"/>
+              <w:bottom w:type="dxa" w:w="80"/>
+              <w:right w:type="dxa" w:w="120"/>
+            </w:tcMar>
+          </w:tcPr>
+          <w:p>
+            <w:r>
+              <w:rPr>
+                <w:b w:val="false"/>
+                <w:bCs w:val="false"/>
+                <w:sz w:val="20"/>
+                <w:szCs w:val="20"/>
+              </w:rPr>
+              <w:t xml:space="preserve">Video menegak 26 saat</w:t>
+            </w:r>
+          </w:p>
+        </w:tc>
+        <w:tc>
+          <w:tcPr>
+            <w:tcW w:type="dxa" w:w="2400"/>
+            <w:tcBorders>
+              <w:top w:val="single" w:color="BFBFBF" w:sz="4"/>
+              <w:left w:val="single" w:color="BFBFBF" w:sz="4"/>
+              <w:bottom w:val="single" w:color="BFBFBF" w:sz="4"/>
+              <w:right w:val="single" w:color="BFBFBF" w:sz="4"/>
+            </w:tcBorders>
+            <w:tcMar>
+              <w:top w:type="dxa" w:w="80"/>
+              <w:left w:type="dxa" w:w="120"/>
+              <w:bottom w:type="dxa" w:w="80"/>
+              <w:right w:type="dxa" w:w="120"/>
+            </w:tcMar>
+          </w:tcPr>
+          <w:p>
+            <w:r>
+              <w:rPr>
+                <w:b w:val="false"/>
+                <w:bCs w:val="false"/>
+                <w:sz w:val="20"/>
+                <w:szCs w:val="20"/>
+              </w:rPr>
+              <w:t xml:space="preserve">Status WhatsApp, TikTok, Reels</w:t>
+            </w:r>
+          </w:p>
+        </w:tc>
+      </w:tr>
+      <w:tr>
+        <w:trPr>
+          <w:cantSplit/>
+        </w:trPr>
+        <w:tc>
+          <w:tcPr>
+            <w:tcW w:type="dxa" w:w="2200"/>
+            <w:tcBorders>
+              <w:top w:val="single" w:color="BFBFBF" w:sz="4"/>
+              <w:left w:val="single" w:color="BFBFBF" w:sz="4"/>
+              <w:bottom w:val="single" w:color="BFBFBF" w:sz="4"/>
+              <w:right w:val="single" w:color="BFBFBF" w:sz="4"/>
+            </w:tcBorders>
+            <w:tcMar>
+              <w:top w:type="dxa" w:w="80"/>
+              <w:left w:type="dxa" w:w="120"/>
+              <w:bottom w:type="dxa" w:w="80"/>
+              <w:right w:type="dxa" w:w="120"/>
+            </w:tcMar>
+          </w:tcPr>
+          <w:p>
+            <w:r>
+              <w:rPr>
+                <w:b w:val="false"/>
+                <w:bCs w:val="false"/>
+                <w:sz w:val="20"/>
+                <w:szCs w:val="20"/>
+              </w:rPr>
+              <w:t xml:space="preserve">Video demo produk</w:t>
+            </w:r>
+          </w:p>
+        </w:tc>
+        <w:tc>
+          <w:tcPr>
+            <w:tcW w:type="dxa" w:w="4426"/>
+            <w:tcBorders>
+              <w:top w:val="single" w:color="BFBFBF" w:sz="4"/>
+              <w:left w:val="single" w:color="BFBFBF" w:sz="4"/>
+              <w:bottom w:val="single" w:color="BFBFBF" w:sz="4"/>
+              <w:right w:val="single" w:color="BFBFBF" w:sz="4"/>
+            </w:tcBorders>
+            <w:tcMar>
+              <w:top w:type="dxa" w:w="80"/>
+              <w:left w:type="dxa" w:w="120"/>
+              <w:bottom w:type="dxa" w:w="80"/>
+              <w:right w:type="dxa" w:w="120"/>
+            </w:tcMar>
+          </w:tcPr>
+          <w:p>
+            <w:r>
+              <w:rPr>
+                <w:b w:val="false"/>
+                <w:bCs w:val="false"/>
+                <w:sz w:val="20"/>
+                <w:szCs w:val="20"/>
+              </w:rPr>
+              <w:t xml:space="preserve">Video menegak 31 saat yang menunjukkan isi buku dan cara penggunaan</w:t>
+            </w:r>
+          </w:p>
+        </w:tc>
+        <w:tc>
+          <w:tcPr>
+            <w:tcW w:type="dxa" w:w="2400"/>
+            <w:tcBorders>
+              <w:top w:val="single" w:color="BFBFBF" w:sz="4"/>
+              <w:left w:val="single" w:color="BFBFBF" w:sz="4"/>
+              <w:bottom w:val="single" w:color="BFBFBF" w:sz="4"/>
+              <w:right w:val="single" w:color="BFBFBF" w:sz="4"/>
+            </w:tcBorders>
+            <w:tcMar>
+              <w:top w:type="dxa" w:w="80"/>
+              <w:left w:type="dxa" w:w="120"/>
+              <w:bottom w:type="dxa" w:w="80"/>
+              <w:right w:type="dxa" w:w="120"/>
+            </w:tcMar>
+          </w:tcPr>
+          <w:p>
+            <w:r>
+              <w:rPr>
+                <w:b w:val="false"/>
+                <w:bCs w:val="false"/>
+                <w:sz w:val="20"/>
+                <w:szCs w:val="20"/>
+              </w:rPr>
+              <w:t xml:space="preserve">Status WhatsApp, TikTok, Reels</w:t>
+            </w:r>
+          </w:p>
+        </w:tc>
+      </w:tr>
+      <w:tr>
+        <w:trPr>
+          <w:cantSplit/>
+        </w:trPr>
+        <w:tc>
+          <w:tcPr>
+            <w:tcW w:type="dxa" w:w="2200"/>
+            <w:tcBorders>
+              <w:top w:val="single" w:color="BFBFBF" w:sz="4"/>
+              <w:left w:val="single" w:color="BFBFBF" w:sz="4"/>
+              <w:bottom w:val="single" w:color="BFBFBF" w:sz="4"/>
+              <w:right w:val="single" w:color="BFBFBF" w:sz="4"/>
+            </w:tcBorders>
+            <w:tcMar>
+              <w:top w:type="dxa" w:w="80"/>
+              <w:left w:type="dxa" w:w="120"/>
+              <w:bottom w:type="dxa" w:w="80"/>
+              <w:right w:type="dxa" w:w="120"/>
+            </w:tcMar>
+          </w:tcPr>
+          <w:p>
+            <w:r>
+              <w:rPr>
+                <w:b w:val="false"/>
+                <w:bCs w:val="false"/>
+                <w:sz w:val="20"/>
+                <w:szCs w:val="20"/>
+              </w:rPr>
+              <w:t xml:space="preserve">Kapsyen jualan</w:t>
+            </w:r>
+          </w:p>
+        </w:tc>
+        <w:tc>
+          <w:tcPr>
+            <w:tcW w:type="dxa" w:w="4426"/>
+            <w:tcBorders>
+              <w:top w:val="single" w:color="BFBFBF" w:sz="4"/>
+              <w:left w:val="single" w:color="BFBFBF" w:sz="4"/>
+              <w:bottom w:val="single" w:color="BFBFBF" w:sz="4"/>
+              <w:right w:val="single" w:color="BFBFBF" w:sz="4"/>
+            </w:tcBorders>
+            <w:tcMar>
+              <w:top w:type="dxa" w:w="80"/>
+              <w:left w:type="dxa" w:w="120"/>
+              <w:bottom w:type="dxa" w:w="80"/>
+              <w:right w:type="dxa" w:w="120"/>
+            </w:tcMar>
+          </w:tcPr>
+          <w:p>
+            <w:r>
+              <w:rPr>
+                <w:b w:val="false"/>
+                <w:bCs w:val="false"/>
+                <w:sz w:val="20"/>
+                <w:szCs w:val="20"/>
+              </w:rPr>
+              <w:t xml:space="preserve">Teks promosi dengan senarai siri, harga dan hashtag</w:t>
+            </w:r>
+          </w:p>
+        </w:tc>
+        <w:tc>
+          <w:tcPr>
+            <w:tcW w:type="dxa" w:w="2400"/>
+            <w:tcBorders>
+              <w:top w:val="single" w:color="BFBFBF" w:sz="4"/>
+              <w:left w:val="single" w:color="BFBFBF" w:sz="4"/>
+              <w:bottom w:val="single" w:color="BFBFBF" w:sz="4"/>
+              <w:right w:val="single" w:color="BFBFBF" w:sz="4"/>
+            </w:tcBorders>
+            <w:tcMar>
+              <w:top w:type="dxa" w:w="80"/>
+              <w:left w:type="dxa" w:w="120"/>
+              <w:bottom w:type="dxa" w:w="80"/>
+              <w:right w:type="dxa" w:w="120"/>
+            </w:tcMar>
+          </w:tcPr>
+          <w:p>
+            <w:r>
+              <w:rPr>
+                <w:b w:val="false"/>
+                <w:bCs w:val="false"/>
+                <w:sz w:val="20"/>
+                <w:szCs w:val="20"/>
+              </w:rPr>
+              <w:t xml:space="preserve">Semua platform</w:t>
+            </w:r>
+          </w:p>
+        </w:tc>
+      </w:tr>
+      <w:tr>
+        <w:trPr>
+          <w:cantSplit/>
+        </w:trPr>
+        <w:tc>
+          <w:tcPr>
+            <w:tcW w:type="dxa" w:w="2200"/>
+            <w:tcBorders>
+              <w:top w:val="single" w:color="BFBFBF" w:sz="4"/>
+              <w:left w:val="single" w:color="BFBFBF" w:sz="4"/>
+              <w:bottom w:val="single" w:color="BFBFBF" w:sz="4"/>
+              <w:right w:val="single" w:color="BFBFBF" w:sz="4"/>
+            </w:tcBorders>
+            <w:tcMar>
+              <w:top w:type="dxa" w:w="80"/>
+              <w:left w:type="dxa" w:w="120"/>
+              <w:bottom w:type="dxa" w:w="80"/>
+              <w:right w:type="dxa" w:w="120"/>
+            </w:tcMar>
+          </w:tcPr>
+          <w:p>
+            <w:r>
+              <w:rPr>
+                <w:b w:val="false"/>
+                <w:bCs w:val="false"/>
+                <w:sz w:val="20"/>
+                <w:szCs w:val="20"/>
+              </w:rPr>
+              <w:t xml:space="preserve">Mesej auto-balas</w:t>
+            </w:r>
+          </w:p>
+        </w:tc>
+        <w:tc>
+          <w:tcPr>
+            <w:tcW w:type="dxa" w:w="4426"/>
+            <w:tcBorders>
+              <w:top w:val="single" w:color="BFBFBF" w:sz="4"/>
+              <w:left w:val="single" w:color="BFBFBF" w:sz="4"/>
+              <w:bottom w:val="single" w:color="BFBFBF" w:sz="4"/>
+              <w:right w:val="single" w:color="BFBFBF" w:sz="4"/>
+            </w:tcBorders>
+            <w:tcMar>
+              <w:top w:type="dxa" w:w="80"/>
+              <w:left w:type="dxa" w:w="120"/>
+              <w:bottom w:type="dxa" w:w="80"/>
+              <w:right w:type="dxa" w:w="120"/>
+            </w:tcMar>
+          </w:tcPr>
+          <w:p>
+            <w:r>
+              <w:rPr>
+                <w:b w:val="false"/>
+                <w:bCs w:val="false"/>
+                <w:sz w:val="20"/>
+                <w:szCs w:val="20"/>
+              </w:rPr>
+              <w:t xml:space="preserve">Mesej sapaan, mesej tidak hadir dan 7 balasan pantas</w:t>
+            </w:r>
+          </w:p>
+        </w:tc>
+        <w:tc>
+          <w:tcPr>
+            <w:tcW w:type="dxa" w:w="2400"/>
+            <w:tcBorders>
+              <w:top w:val="single" w:color="BFBFBF" w:sz="4"/>
+              <w:left w:val="single" w:color="BFBFBF" w:sz="4"/>
+              <w:bottom w:val="single" w:color="BFBFBF" w:sz="4"/>
+              <w:right w:val="single" w:color="BFBFBF" w:sz="4"/>
+            </w:tcBorders>
+            <w:tcMar>
+              <w:top w:type="dxa" w:w="80"/>
+              <w:left w:type="dxa" w:w="120"/>
+              <w:bottom w:type="dxa" w:w="80"/>
+              <w:right w:type="dxa" w:w="120"/>
+            </w:tcMar>
+          </w:tcPr>
+          <w:p>
+            <w:r>
+              <w:rPr>
+                <w:b w:val="false"/>
+                <w:bCs w:val="false"/>
+                <w:sz w:val="20"/>
+                <w:szCs w:val="20"/>
+              </w:rPr>
+              <w:t xml:space="preserve">WhatsApp Business</w:t>
+            </w:r>
+          </w:p>
+        </w:tc>
+      </w:tr>
+    </w:tbl>
+    <w:p>
+      <w:pPr>
+        <w:spacing w:after="80"/>
+      </w:pPr>
+    </w:p>
+    <w:p>
+      <w:pPr>
+        <w:spacing w:after="120"/>
+        <w:jc w:val="center"/>
+      </w:pPr>
       <w:r>
         <w:drawing>
           <wp:inline distT="0" distB="0" distL="0" distR="0">
-            <wp:extent cx="1809750" cy="647700"/>
+            <wp:extent cx="3143250" cy="3933825"/>
             <wp:effectExtent t="0" r="0" b="0" l="0"/>
             <wp:docPr id="1" name="" descr="" title=""/>
             <wp:cNvGraphicFramePr>
@@ -78,1874 +1903,6 @@
                   <pic:spPr bwMode="auto">
                     <a:xfrm>
                       <a:off x="0" y="0"/>
-                      <a:ext cx="1809750" cy="647700"/>
-                    </a:xfrm>
-                    <a:prstGeom prst="rect">
-                      <a:avLst/>
-                    </a:prstGeom>
-                  </pic:spPr>
-                </pic:pic>
-              </a:graphicData>
-            </a:graphic>
-          </wp:inline>
-        </w:drawing>
-      </w:r>
-    </w:p>
-    <w:p>
-      <w:pPr>
-        <w:spacing w:after="200"/>
-        <w:jc w:val="center"/>
-      </w:pPr>
-      <w:r>
-        <w:rPr>
-          <w:b/>
-          <w:bCs/>
-          <w:sz w:val="36"/>
-          <w:szCs w:val="36"/>
-        </w:rPr>
-        <w:t xml:space="preserve">LAPORAN AKTIVITI PEMASARAN</w:t>
-      </w:r>
-    </w:p>
-    <w:p>
-      <w:pPr>
-        <w:spacing w:after="80"/>
-        <w:jc w:val="center"/>
-      </w:pPr>
-      <w:r>
-        <w:rPr>
-          <w:b/>
-          <w:bCs/>
-          <w:sz w:val="28"/>
-          <w:szCs w:val="28"/>
-        </w:rPr>
-        <w:t xml:space="preserve">E-BOOK BUKU MEWARNA FSKXPERT</w:t>
-      </w:r>
-    </w:p>
-    <w:p>
-      <w:pPr>
-        <w:spacing w:after="900"/>
-        <w:jc w:val="center"/>
-      </w:pPr>
-      <w:r>
-        <w:rPr>
-          <w:b/>
-          <w:bCs/>
-          <w:sz w:val="28"/>
-          <w:szCs w:val="28"/>
-        </w:rPr>
-        <w:t xml:space="preserve">MELALUI WHATSAPP DAN MEDIA SOSIAL</w:t>
-      </w:r>
-    </w:p>
-    <w:p>
-      <w:pPr>
-        <w:spacing w:after="100"/>
-        <w:jc w:val="center"/>
-      </w:pPr>
-      <w:r>
-        <w:rPr>
-          <w:b/>
-          <w:bCs/>
-          <w:sz w:val="22"/>
-          <w:szCs w:val="22"/>
-        </w:rPr>
-        <w:t xml:space="preserve">DISEDIAKAN UNTUK:</w:t>
-      </w:r>
-    </w:p>
-    <w:p>
-      <w:pPr>
-        <w:spacing w:after="80"/>
-        <w:jc w:val="center"/>
-      </w:pPr>
-      <w:r>
-        <w:rPr>
-          <w:highlight w:val="yellow"/>
-          <w:highlightCs w:val="yellow"/>
-        </w:rPr>
-        <w:t xml:space="preserve">[NAMA PENYELIA]</w:t>
-      </w:r>
-    </w:p>
-    <w:p>
-      <w:pPr>
-        <w:spacing w:after="80"/>
-        <w:jc w:val="center"/>
-      </w:pPr>
-      <w:r>
-        <w:rPr>
-          <w:b w:val="false"/>
-          <w:bCs w:val="false"/>
-          <w:sz w:val="22"/>
-          <w:szCs w:val="22"/>
-        </w:rPr>
-        <w:t xml:space="preserve">Penyelia Latihan Industri</w:t>
-      </w:r>
-    </w:p>
-    <w:p>
-      <w:pPr>
-        <w:spacing w:after="600"/>
-        <w:jc w:val="center"/>
-      </w:pPr>
-      <w:r>
-        <w:rPr>
-          <w:b w:val="false"/>
-          <w:bCs w:val="false"/>
-          <w:sz w:val="22"/>
-          <w:szCs w:val="22"/>
-        </w:rPr>
-        <w:t xml:space="preserve">Fakulti Sains Kemanusiaan</w:t>
-      </w:r>
-    </w:p>
-    <w:p>
-      <w:pPr>
-        <w:spacing w:after="100"/>
-        <w:jc w:val="center"/>
-      </w:pPr>
-      <w:r>
-        <w:rPr>
-          <w:b/>
-          <w:bCs/>
-          <w:sz w:val="22"/>
-          <w:szCs w:val="22"/>
-        </w:rPr>
-        <w:t xml:space="preserve">DISEDIAKAN OLEH:</w:t>
-      </w:r>
-    </w:p>
-    <w:p>
-      <w:pPr>
-        <w:spacing w:after="80"/>
-        <w:jc w:val="center"/>
-      </w:pPr>
-      <w:r>
-        <w:rPr>
-          <w:b w:val="false"/>
-          <w:bCs w:val="false"/>
-          <w:sz w:val="22"/>
-          <w:szCs w:val="22"/>
-        </w:rPr>
-        <w:t xml:space="preserve">NUR FATIN LIYANA BINTI MOHD FAZIL</w:t>
-      </w:r>
-    </w:p>
-    <w:p>
-      <w:pPr>
-        <w:spacing w:after="600"/>
-        <w:jc w:val="center"/>
-      </w:pPr>
-      <w:r>
-        <w:rPr>
-          <w:b w:val="false"/>
-          <w:bCs w:val="false"/>
-          <w:sz w:val="22"/>
-          <w:szCs w:val="22"/>
-        </w:rPr>
-        <w:t xml:space="preserve">E20251036252</w:t>
-      </w:r>
-    </w:p>
-    <w:p>
-      <w:pPr>
-        <w:spacing w:after="80"/>
-        <w:jc w:val="center"/>
-      </w:pPr>
-      <w:r>
-        <w:rPr>
-          <w:b/>
-          <w:bCs/>
-          <w:sz w:val="22"/>
-          <w:szCs w:val="22"/>
-        </w:rPr>
-        <w:t xml:space="preserve">Tempoh aktiviti: </w:t>
-      </w:r>
-      <w:r>
-        <w:rPr>
-          <w:highlight w:val="yellow"/>
-          <w:highlightCs w:val="yellow"/>
-        </w:rPr>
-        <w:t xml:space="preserve">[tarikh mula]</w:t>
-      </w:r>
-      <w:r>
-        <w:rPr>
-          <w:sz w:val="22"/>
-          <w:szCs w:val="22"/>
-        </w:rPr>
-        <w:t xml:space="preserve"> hingga </w:t>
-      </w:r>
-      <w:r>
-        <w:rPr>
-          <w:highlight w:val="yellow"/>
-          <w:highlightCs w:val="yellow"/>
-        </w:rPr>
-        <w:t xml:space="preserve">[tarikh tamat]</w:t>
-      </w:r>
-    </w:p>
-    <w:p>
-      <w:pPr>
-        <w:spacing w:after="600"/>
-        <w:jc w:val="center"/>
-      </w:pPr>
-      <w:r>
-        <w:rPr>
-          <w:b/>
-          <w:bCs/>
-          <w:sz w:val="22"/>
-          <w:szCs w:val="22"/>
-        </w:rPr>
-        <w:t xml:space="preserve">Tarikh hantar: </w:t>
-      </w:r>
-      <w:r>
-        <w:rPr>
-          <w:highlight w:val="yellow"/>
-          <w:highlightCs w:val="yellow"/>
-        </w:rPr>
-        <w:t xml:space="preserve">[tarikh]</w:t>
-      </w:r>
-    </w:p>
-    <w:p>
-      <w:pPr>
-        <w:spacing w:after="60"/>
-        <w:jc w:val="center"/>
-      </w:pPr>
-      <w:r>
-        <w:rPr>
-          <w:b/>
-          <w:bCs/>
-          <w:sz w:val="22"/>
-          <w:szCs w:val="22"/>
-        </w:rPr>
-        <w:t xml:space="preserve">FAKULTI SAINS KEMANUSIAAN</w:t>
-      </w:r>
-    </w:p>
-    <w:p>
-      <w:pPr>
-        <w:spacing w:after="0"/>
-        <w:jc w:val="center"/>
-      </w:pPr>
-      <w:r>
-        <w:rPr>
-          <w:b/>
-          <w:bCs/>
-          <w:sz w:val="22"/>
-          <w:szCs w:val="22"/>
-        </w:rPr>
-        <w:t xml:space="preserve">UNIVERSITI PENDIDIKAN SULTAN IDRIS</w:t>
-      </w:r>
-    </w:p>
-    <w:p>
-      <w:pPr>
-        <w:sectPr>
-          <w:pgSz w:w="11906" w:h="16838" w:orient="portrait"/>
-          <w:pgMar w:top="1440" w:right="1440" w:bottom="1440" w:left="1440" w:header="708" w:footer="708" w:gutter="0"/>
-          <w:pgNumType/>
-          <w:docGrid w:linePitch="360"/>
-        </w:sectPr>
-      </w:pPr>
-    </w:p>
-    <w:p>
-      <w:pPr>
-        <w:spacing w:after="240"/>
-        <w:jc w:val="center"/>
-      </w:pPr>
-      <w:r>
-        <w:rPr>
-          <w:b/>
-          <w:bCs/>
-          <w:sz w:val="26"/>
-          <w:szCs w:val="26"/>
-        </w:rPr>
-        <w:t xml:space="preserve">ISI KANDUNGAN</w:t>
-      </w:r>
-    </w:p>
-    <w:sdt>
-      <w:sdtPr>
-        <w:alias w:val="Isi Kandungan"/>
-      </w:sdtPr>
-      <w:sdtContent>
-        <w:p>
-          <w:r>
-            <w:fldChar w:fldCharType="begin" w:dirty="true"/>
-            <w:instrText xml:space="preserve">TOC \h \o "1-2"</w:instrText>
-            <w:fldChar w:fldCharType="separate"/>
-          </w:r>
-        </w:p>
-        <w:p>
-          <w:r>
-            <w:fldChar w:fldCharType="end"/>
-          </w:r>
-        </w:p>
-      </w:sdtContent>
-    </w:sdt>
-    <w:p>
-      <w:r>
-        <w:br w:type="page"/>
-      </w:r>
-    </w:p>
-    <w:p>
-      <w:pPr>
-        <w:pStyle w:val="Heading1"/>
-      </w:pPr>
-      <w:r>
-        <w:t xml:space="preserve">1.0 PENGENALAN</w:t>
-      </w:r>
-    </w:p>
-    <w:p>
-      <w:pPr>
-        <w:spacing w:after="160" w:line="360"/>
-        <w:jc w:val="both"/>
-      </w:pPr>
-      <w:r>
-        <w:t xml:space="preserve">Sepanjang latihan industri di FSKXpert, Fakulti Sains Kemanusiaan, saya telah dipertanggungjawabkan untuk memasarkan koleksi 10 e-book buku mewarna FSKXpert. Pemasaran dijalankan melalui aplikasi WhatsApp dan media sosial.</w:t>
-      </w:r>
-    </w:p>
-    <w:p>
-      <w:pPr>
-        <w:spacing w:after="160" w:line="360"/>
-        <w:jc w:val="both"/>
-      </w:pPr>
-      <w:r>
-        <w:t xml:space="preserve">Laporan ini merekodkan setiap aktiviti pemasaran yang telah saya laksanakan, hasil yang diperoleh serta bukti tangkap layar bagi setiap aktiviti. Laporan ini juga memuatkan masalah yang dihadapi, pengajaran yang diperoleh dan cadangan penambahbaikan.</w:t>
-      </w:r>
-    </w:p>
-    <w:p>
-      <w:pPr>
-        <w:pStyle w:val="Heading1"/>
-      </w:pPr>
-      <w:r>
-        <w:t xml:space="preserve">2.0 OBJEKTIF</w:t>
-      </w:r>
-    </w:p>
-    <w:p>
-      <w:pPr>
-        <w:spacing w:after="160" w:line="360"/>
-        <w:jc w:val="both"/>
-      </w:pPr>
-      <w:r>
-        <w:t xml:space="preserve">Aktiviti pemasaran ini dijalankan untuk:</w:t>
-      </w:r>
-    </w:p>
-    <w:p>
-      <w:pPr>
-        <w:pStyle w:val="ListParagraph"/>
-        <w:numPr>
-          <w:ilvl w:val="0"/>
-          <w:numId w:val="2"/>
-        </w:numPr>
-        <w:spacing w:after="80" w:line="320"/>
-      </w:pPr>
-      <w:r>
-        <w:t xml:space="preserve">Memperkenalkan koleksi e-book buku mewarna FSKXpert kepada ibu bapa, guru dan orang ramai.</w:t>
-      </w:r>
-    </w:p>
-    <w:p>
-      <w:pPr>
-        <w:pStyle w:val="ListParagraph"/>
-        <w:numPr>
-          <w:ilvl w:val="0"/>
-          <w:numId w:val="2"/>
-        </w:numPr>
-        <w:spacing w:after="80" w:line="320"/>
-      </w:pPr>
-      <w:r>
-        <w:t xml:space="preserve">Menjana pertanyaan dan jualan melalui WhatsApp pada harga promosi RM15.</w:t>
-      </w:r>
-    </w:p>
-    <w:p>
-      <w:pPr>
-        <w:pStyle w:val="ListParagraph"/>
-        <w:numPr>
-          <w:ilvl w:val="0"/>
-          <w:numId w:val="2"/>
-        </w:numPr>
-        <w:spacing w:after="80" w:line="320"/>
-      </w:pPr>
-      <w:r>
-        <w:t xml:space="preserve">Menguji keberkesanan WhatsApp dan media sosial sebagai saluran jualan produk digital.</w:t>
-      </w:r>
-    </w:p>
-    <w:p>
-      <w:pPr>
-        <w:pStyle w:val="ListParagraph"/>
-        <w:numPr>
-          <w:ilvl w:val="0"/>
-          <w:numId w:val="2"/>
-        </w:numPr>
-        <w:spacing w:after="80" w:line="320"/>
-      </w:pPr>
-      <w:r>
-        <w:t xml:space="preserve">Membina senarai pelanggan bagi promosi siri akan datang.</w:t>
-      </w:r>
-    </w:p>
-    <w:p>
-      <w:pPr>
-        <w:pStyle w:val="Heading1"/>
-      </w:pPr>
-      <w:r>
-        <w:t xml:space="preserve">3.0 MAKLUMAT PRODUK</w:t>
-      </w:r>
-    </w:p>
-    <w:tbl>
-      <w:tblPr>
-        <w:tblW w:type="dxa" w:w="9026"/>
-        <w:tblBorders>
-          <w:top w:val="single" w:color="auto" w:sz="4"/>
-          <w:left w:val="single" w:color="auto" w:sz="4"/>
-          <w:bottom w:val="single" w:color="auto" w:sz="4"/>
-          <w:right w:val="single" w:color="auto" w:sz="4"/>
-          <w:insideH w:val="single" w:color="auto" w:sz="4"/>
-          <w:insideV w:val="single" w:color="auto" w:sz="4"/>
-        </w:tblBorders>
-      </w:tblPr>
-      <w:tblGrid>
-        <w:gridCol w:w="2600"/>
-        <w:gridCol w:w="6426"/>
-      </w:tblGrid>
-      <w:tr>
-        <w:trPr>
-          <w:tblHeader/>
-        </w:trPr>
-        <w:tc>
-          <w:tcPr>
-            <w:tcW w:type="dxa" w:w="2600"/>
-            <w:tcBorders>
-              <w:top w:val="single" w:color="BFBFBF" w:sz="4"/>
-              <w:left w:val="single" w:color="BFBFBF" w:sz="4"/>
-              <w:bottom w:val="single" w:color="BFBFBF" w:sz="4"/>
-              <w:right w:val="single" w:color="BFBFBF" w:sz="4"/>
-            </w:tcBorders>
-            <w:shd w:fill="DCE6F2" w:color="auto" w:val="clear"/>
-            <w:tcMar>
-              <w:top w:type="dxa" w:w="80"/>
-              <w:left w:type="dxa" w:w="120"/>
-              <w:bottom w:type="dxa" w:w="80"/>
-              <w:right w:type="dxa" w:w="120"/>
-            </w:tcMar>
-          </w:tcPr>
-          <w:p>
-            <w:r>
-              <w:rPr>
-                <w:b/>
-                <w:bCs/>
-                <w:i w:val="false"/>
-                <w:iCs w:val="false"/>
-                <w:sz w:val="20"/>
-                <w:szCs w:val="20"/>
-              </w:rPr>
-              <w:t xml:space="preserve">Perkara</w:t>
-            </w:r>
-          </w:p>
-        </w:tc>
-        <w:tc>
-          <w:tcPr>
-            <w:tcW w:type="dxa" w:w="6426"/>
-            <w:tcBorders>
-              <w:top w:val="single" w:color="BFBFBF" w:sz="4"/>
-              <w:left w:val="single" w:color="BFBFBF" w:sz="4"/>
-              <w:bottom w:val="single" w:color="BFBFBF" w:sz="4"/>
-              <w:right w:val="single" w:color="BFBFBF" w:sz="4"/>
-            </w:tcBorders>
-            <w:shd w:fill="DCE6F2" w:color="auto" w:val="clear"/>
-            <w:tcMar>
-              <w:top w:type="dxa" w:w="80"/>
-              <w:left w:type="dxa" w:w="120"/>
-              <w:bottom w:type="dxa" w:w="80"/>
-              <w:right w:type="dxa" w:w="120"/>
-            </w:tcMar>
-          </w:tcPr>
-          <w:p>
-            <w:r>
-              <w:rPr>
-                <w:b/>
-                <w:bCs/>
-                <w:i w:val="false"/>
-                <w:iCs w:val="false"/>
-                <w:sz w:val="20"/>
-                <w:szCs w:val="20"/>
-              </w:rPr>
-              <w:t xml:space="preserve">Butiran</w:t>
-            </w:r>
-          </w:p>
-        </w:tc>
-      </w:tr>
-      <w:tr>
-        <w:trPr>
-          <w:cantSplit/>
-        </w:trPr>
-        <w:tc>
-          <w:tcPr>
-            <w:tcW w:type="dxa" w:w="2600"/>
-            <w:tcBorders>
-              <w:top w:val="single" w:color="BFBFBF" w:sz="4"/>
-              <w:left w:val="single" w:color="BFBFBF" w:sz="4"/>
-              <w:bottom w:val="single" w:color="BFBFBF" w:sz="4"/>
-              <w:right w:val="single" w:color="BFBFBF" w:sz="4"/>
-            </w:tcBorders>
-            <w:tcMar>
-              <w:top w:type="dxa" w:w="80"/>
-              <w:left w:type="dxa" w:w="120"/>
-              <w:bottom w:type="dxa" w:w="80"/>
-              <w:right w:type="dxa" w:w="120"/>
-            </w:tcMar>
-          </w:tcPr>
-          <w:p>
-            <w:r>
-              <w:rPr>
-                <w:b w:val="false"/>
-                <w:bCs w:val="false"/>
-                <w:sz w:val="20"/>
-                <w:szCs w:val="20"/>
-              </w:rPr>
-              <w:t xml:space="preserve">Nama produk</w:t>
-            </w:r>
-          </w:p>
-        </w:tc>
-        <w:tc>
-          <w:tcPr>
-            <w:tcW w:type="dxa" w:w="6426"/>
-            <w:tcBorders>
-              <w:top w:val="single" w:color="BFBFBF" w:sz="4"/>
-              <w:left w:val="single" w:color="BFBFBF" w:sz="4"/>
-              <w:bottom w:val="single" w:color="BFBFBF" w:sz="4"/>
-              <w:right w:val="single" w:color="BFBFBF" w:sz="4"/>
-            </w:tcBorders>
-            <w:tcMar>
-              <w:top w:type="dxa" w:w="80"/>
-              <w:left w:type="dxa" w:w="120"/>
-              <w:bottom w:type="dxa" w:w="80"/>
-              <w:right w:type="dxa" w:w="120"/>
-            </w:tcMar>
-          </w:tcPr>
-          <w:p>
-            <w:r>
-              <w:rPr>
-                <w:b w:val="false"/>
-                <w:bCs w:val="false"/>
-                <w:sz w:val="20"/>
-                <w:szCs w:val="20"/>
-              </w:rPr>
-              <w:t xml:space="preserve">Koleksi E-Book Buku Mewarna FSKXpert</w:t>
-            </w:r>
-          </w:p>
-        </w:tc>
-      </w:tr>
-      <w:tr>
-        <w:trPr>
-          <w:cantSplit/>
-        </w:trPr>
-        <w:tc>
-          <w:tcPr>
-            <w:tcW w:type="dxa" w:w="2600"/>
-            <w:tcBorders>
-              <w:top w:val="single" w:color="BFBFBF" w:sz="4"/>
-              <w:left w:val="single" w:color="BFBFBF" w:sz="4"/>
-              <w:bottom w:val="single" w:color="BFBFBF" w:sz="4"/>
-              <w:right w:val="single" w:color="BFBFBF" w:sz="4"/>
-            </w:tcBorders>
-            <w:tcMar>
-              <w:top w:type="dxa" w:w="80"/>
-              <w:left w:type="dxa" w:w="120"/>
-              <w:bottom w:type="dxa" w:w="80"/>
-              <w:right w:type="dxa" w:w="120"/>
-            </w:tcMar>
-          </w:tcPr>
-          <w:p>
-            <w:r>
-              <w:rPr>
-                <w:b w:val="false"/>
-                <w:bCs w:val="false"/>
-                <w:sz w:val="20"/>
-                <w:szCs w:val="20"/>
-              </w:rPr>
-              <w:t xml:space="preserve">Kandungan</w:t>
-            </w:r>
-          </w:p>
-        </w:tc>
-        <w:tc>
-          <w:tcPr>
-            <w:tcW w:type="dxa" w:w="6426"/>
-            <w:tcBorders>
-              <w:top w:val="single" w:color="BFBFBF" w:sz="4"/>
-              <w:left w:val="single" w:color="BFBFBF" w:sz="4"/>
-              <w:bottom w:val="single" w:color="BFBFBF" w:sz="4"/>
-              <w:right w:val="single" w:color="BFBFBF" w:sz="4"/>
-            </w:tcBorders>
-            <w:tcMar>
-              <w:top w:type="dxa" w:w="80"/>
-              <w:left w:type="dxa" w:w="120"/>
-              <w:bottom w:type="dxa" w:w="80"/>
-              <w:right w:type="dxa" w:w="120"/>
-            </w:tcMar>
-          </w:tcPr>
-          <w:p>
-            <w:r>
-              <w:rPr>
-                <w:b w:val="false"/>
-                <w:bCs w:val="false"/>
-                <w:sz w:val="20"/>
-                <w:szCs w:val="20"/>
-              </w:rPr>
-              <w:t xml:space="preserve">10 siri buku mewarna, 30 halaman bagi setiap buku</w:t>
-            </w:r>
-          </w:p>
-        </w:tc>
-      </w:tr>
-      <w:tr>
-        <w:trPr>
-          <w:cantSplit/>
-        </w:trPr>
-        <w:tc>
-          <w:tcPr>
-            <w:tcW w:type="dxa" w:w="2600"/>
-            <w:tcBorders>
-              <w:top w:val="single" w:color="BFBFBF" w:sz="4"/>
-              <w:left w:val="single" w:color="BFBFBF" w:sz="4"/>
-              <w:bottom w:val="single" w:color="BFBFBF" w:sz="4"/>
-              <w:right w:val="single" w:color="BFBFBF" w:sz="4"/>
-            </w:tcBorders>
-            <w:tcMar>
-              <w:top w:type="dxa" w:w="80"/>
-              <w:left w:type="dxa" w:w="120"/>
-              <w:bottom w:type="dxa" w:w="80"/>
-              <w:right w:type="dxa" w:w="120"/>
-            </w:tcMar>
-          </w:tcPr>
-          <w:p>
-            <w:r>
-              <w:rPr>
-                <w:b w:val="false"/>
-                <w:bCs w:val="false"/>
-                <w:sz w:val="20"/>
-                <w:szCs w:val="20"/>
-              </w:rPr>
-              <w:t xml:space="preserve">Format</w:t>
-            </w:r>
-          </w:p>
-        </w:tc>
-        <w:tc>
-          <w:tcPr>
-            <w:tcW w:type="dxa" w:w="6426"/>
-            <w:tcBorders>
-              <w:top w:val="single" w:color="BFBFBF" w:sz="4"/>
-              <w:left w:val="single" w:color="BFBFBF" w:sz="4"/>
-              <w:bottom w:val="single" w:color="BFBFBF" w:sz="4"/>
-              <w:right w:val="single" w:color="BFBFBF" w:sz="4"/>
-            </w:tcBorders>
-            <w:tcMar>
-              <w:top w:type="dxa" w:w="80"/>
-              <w:left w:type="dxa" w:w="120"/>
-              <w:bottom w:type="dxa" w:w="80"/>
-              <w:right w:type="dxa" w:w="120"/>
-            </w:tcMar>
-          </w:tcPr>
-          <w:p>
-            <w:r>
-              <w:rPr>
-                <w:b w:val="false"/>
-                <w:bCs w:val="false"/>
-                <w:sz w:val="20"/>
-                <w:szCs w:val="20"/>
-              </w:rPr>
-              <w:t xml:space="preserve">PDF saiz A4, 300 DPI, boleh dicetak berulang kali</w:t>
-            </w:r>
-          </w:p>
-        </w:tc>
-      </w:tr>
-      <w:tr>
-        <w:trPr>
-          <w:cantSplit/>
-        </w:trPr>
-        <w:tc>
-          <w:tcPr>
-            <w:tcW w:type="dxa" w:w="2600"/>
-            <w:tcBorders>
-              <w:top w:val="single" w:color="BFBFBF" w:sz="4"/>
-              <w:left w:val="single" w:color="BFBFBF" w:sz="4"/>
-              <w:bottom w:val="single" w:color="BFBFBF" w:sz="4"/>
-              <w:right w:val="single" w:color="BFBFBF" w:sz="4"/>
-            </w:tcBorders>
-            <w:tcMar>
-              <w:top w:type="dxa" w:w="80"/>
-              <w:left w:type="dxa" w:w="120"/>
-              <w:bottom w:type="dxa" w:w="80"/>
-              <w:right w:type="dxa" w:w="120"/>
-            </w:tcMar>
-          </w:tcPr>
-          <w:p>
-            <w:r>
-              <w:rPr>
-                <w:b w:val="false"/>
-                <w:bCs w:val="false"/>
-                <w:sz w:val="20"/>
-                <w:szCs w:val="20"/>
-              </w:rPr>
-              <w:t xml:space="preserve">Sasaran</w:t>
-            </w:r>
-          </w:p>
-        </w:tc>
-        <w:tc>
-          <w:tcPr>
-            <w:tcW w:type="dxa" w:w="6426"/>
-            <w:tcBorders>
-              <w:top w:val="single" w:color="BFBFBF" w:sz="4"/>
-              <w:left w:val="single" w:color="BFBFBF" w:sz="4"/>
-              <w:bottom w:val="single" w:color="BFBFBF" w:sz="4"/>
-              <w:right w:val="single" w:color="BFBFBF" w:sz="4"/>
-            </w:tcBorders>
-            <w:tcMar>
-              <w:top w:type="dxa" w:w="80"/>
-              <w:left w:type="dxa" w:w="120"/>
-              <w:bottom w:type="dxa" w:w="80"/>
-              <w:right w:type="dxa" w:w="120"/>
-            </w:tcMar>
-          </w:tcPr>
-          <w:p>
-            <w:r>
-              <w:rPr>
-                <w:b w:val="false"/>
-                <w:bCs w:val="false"/>
-                <w:sz w:val="20"/>
-                <w:szCs w:val="20"/>
-              </w:rPr>
-              <w:t xml:space="preserve">Kanak-kanak prasekolah dan sekolah rendah</w:t>
-            </w:r>
-          </w:p>
-        </w:tc>
-      </w:tr>
-      <w:tr>
-        <w:trPr>
-          <w:cantSplit/>
-        </w:trPr>
-        <w:tc>
-          <w:tcPr>
-            <w:tcW w:type="dxa" w:w="2600"/>
-            <w:tcBorders>
-              <w:top w:val="single" w:color="BFBFBF" w:sz="4"/>
-              <w:left w:val="single" w:color="BFBFBF" w:sz="4"/>
-              <w:bottom w:val="single" w:color="BFBFBF" w:sz="4"/>
-              <w:right w:val="single" w:color="BFBFBF" w:sz="4"/>
-            </w:tcBorders>
-            <w:tcMar>
-              <w:top w:type="dxa" w:w="80"/>
-              <w:left w:type="dxa" w:w="120"/>
-              <w:bottom w:type="dxa" w:w="80"/>
-              <w:right w:type="dxa" w:w="120"/>
-            </w:tcMar>
-          </w:tcPr>
-          <w:p>
-            <w:r>
-              <w:rPr>
-                <w:b w:val="false"/>
-                <w:bCs w:val="false"/>
-                <w:sz w:val="20"/>
-                <w:szCs w:val="20"/>
-              </w:rPr>
-              <w:t xml:space="preserve">Harga</w:t>
-            </w:r>
-          </w:p>
-        </w:tc>
-        <w:tc>
-          <w:tcPr>
-            <w:tcW w:type="dxa" w:w="6426"/>
-            <w:tcBorders>
-              <w:top w:val="single" w:color="BFBFBF" w:sz="4"/>
-              <w:left w:val="single" w:color="BFBFBF" w:sz="4"/>
-              <w:bottom w:val="single" w:color="BFBFBF" w:sz="4"/>
-              <w:right w:val="single" w:color="BFBFBF" w:sz="4"/>
-            </w:tcBorders>
-            <w:tcMar>
-              <w:top w:type="dxa" w:w="80"/>
-              <w:left w:type="dxa" w:w="120"/>
-              <w:bottom w:type="dxa" w:w="80"/>
-              <w:right w:type="dxa" w:w="120"/>
-            </w:tcMar>
-          </w:tcPr>
-          <w:p>
-            <w:r>
-              <w:rPr>
-                <w:b w:val="false"/>
-                <w:bCs w:val="false"/>
-                <w:sz w:val="20"/>
-                <w:szCs w:val="20"/>
-              </w:rPr>
-              <w:t xml:space="preserve">RM20, harga promosi RM15</w:t>
-            </w:r>
-          </w:p>
-        </w:tc>
-      </w:tr>
-      <w:tr>
-        <w:trPr>
-          <w:cantSplit/>
-        </w:trPr>
-        <w:tc>
-          <w:tcPr>
-            <w:tcW w:type="dxa" w:w="2600"/>
-            <w:tcBorders>
-              <w:top w:val="single" w:color="BFBFBF" w:sz="4"/>
-              <w:left w:val="single" w:color="BFBFBF" w:sz="4"/>
-              <w:bottom w:val="single" w:color="BFBFBF" w:sz="4"/>
-              <w:right w:val="single" w:color="BFBFBF" w:sz="4"/>
-            </w:tcBorders>
-            <w:tcMar>
-              <w:top w:type="dxa" w:w="80"/>
-              <w:left w:type="dxa" w:w="120"/>
-              <w:bottom w:type="dxa" w:w="80"/>
-              <w:right w:type="dxa" w:w="120"/>
-            </w:tcMar>
-          </w:tcPr>
-          <w:p>
-            <w:r>
-              <w:rPr>
-                <w:b w:val="false"/>
-                <w:bCs w:val="false"/>
-                <w:sz w:val="20"/>
-                <w:szCs w:val="20"/>
-              </w:rPr>
-              <w:t xml:space="preserve">Tawaran</w:t>
-            </w:r>
-          </w:p>
-        </w:tc>
-        <w:tc>
-          <w:tcPr>
-            <w:tcW w:type="dxa" w:w="6426"/>
-            <w:tcBorders>
-              <w:top w:val="single" w:color="BFBFBF" w:sz="4"/>
-              <w:left w:val="single" w:color="BFBFBF" w:sz="4"/>
-              <w:bottom w:val="single" w:color="BFBFBF" w:sz="4"/>
-              <w:right w:val="single" w:color="BFBFBF" w:sz="4"/>
-            </w:tcBorders>
-            <w:tcMar>
-              <w:top w:type="dxa" w:w="80"/>
-              <w:left w:type="dxa" w:w="120"/>
-              <w:bottom w:type="dxa" w:w="80"/>
-              <w:right w:type="dxa" w:w="120"/>
-            </w:tcMar>
-          </w:tcPr>
-          <w:p>
-            <w:r>
-              <w:rPr>
-                <w:b w:val="false"/>
-                <w:bCs w:val="false"/>
-                <w:sz w:val="20"/>
-                <w:szCs w:val="20"/>
-              </w:rPr>
-              <w:t xml:space="preserve">9 set buku + 1 buku percuma</w:t>
-            </w:r>
-          </w:p>
-        </w:tc>
-      </w:tr>
-      <w:tr>
-        <w:trPr>
-          <w:cantSplit/>
-        </w:trPr>
-        <w:tc>
-          <w:tcPr>
-            <w:tcW w:type="dxa" w:w="2600"/>
-            <w:tcBorders>
-              <w:top w:val="single" w:color="BFBFBF" w:sz="4"/>
-              <w:left w:val="single" w:color="BFBFBF" w:sz="4"/>
-              <w:bottom w:val="single" w:color="BFBFBF" w:sz="4"/>
-              <w:right w:val="single" w:color="BFBFBF" w:sz="4"/>
-            </w:tcBorders>
-            <w:tcMar>
-              <w:top w:type="dxa" w:w="80"/>
-              <w:left w:type="dxa" w:w="120"/>
-              <w:bottom w:type="dxa" w:w="80"/>
-              <w:right w:type="dxa" w:w="120"/>
-            </w:tcMar>
-          </w:tcPr>
-          <w:p>
-            <w:r>
-              <w:rPr>
-                <w:b w:val="false"/>
-                <w:bCs w:val="false"/>
-                <w:sz w:val="20"/>
-                <w:szCs w:val="20"/>
-              </w:rPr>
-              <w:t xml:space="preserve">Saluran jualan</w:t>
-            </w:r>
-          </w:p>
-        </w:tc>
-        <w:tc>
-          <w:tcPr>
-            <w:tcW w:type="dxa" w:w="6426"/>
-            <w:tcBorders>
-              <w:top w:val="single" w:color="BFBFBF" w:sz="4"/>
-              <w:left w:val="single" w:color="BFBFBF" w:sz="4"/>
-              <w:bottom w:val="single" w:color="BFBFBF" w:sz="4"/>
-              <w:right w:val="single" w:color="BFBFBF" w:sz="4"/>
-            </w:tcBorders>
-            <w:tcMar>
-              <w:top w:type="dxa" w:w="80"/>
-              <w:left w:type="dxa" w:w="120"/>
-              <w:bottom w:type="dxa" w:w="80"/>
-              <w:right w:type="dxa" w:w="120"/>
-            </w:tcMar>
-          </w:tcPr>
-          <w:p>
-            <w:r>
-              <w:rPr>
-                <w:b w:val="false"/>
-                <w:bCs w:val="false"/>
-                <w:sz w:val="20"/>
-                <w:szCs w:val="20"/>
-              </w:rPr>
-              <w:t xml:space="preserve">WhatsApp 010-263 7597 (Cik Nia)</w:t>
-            </w:r>
-          </w:p>
-        </w:tc>
-      </w:tr>
-    </w:tbl>
-    <w:p>
-      <w:pPr>
-        <w:pStyle w:val="Heading1"/>
-      </w:pPr>
-      <w:r>
-        <w:t xml:space="preserve">4.0 SKOP DAN TEMPOH AKTIVITI</w:t>
-      </w:r>
-    </w:p>
-    <w:tbl>
-      <w:tblPr>
-        <w:tblW w:type="dxa" w:w="9026"/>
-        <w:tblBorders>
-          <w:top w:val="single" w:color="auto" w:sz="4"/>
-          <w:left w:val="single" w:color="auto" w:sz="4"/>
-          <w:bottom w:val="single" w:color="auto" w:sz="4"/>
-          <w:right w:val="single" w:color="auto" w:sz="4"/>
-          <w:insideH w:val="single" w:color="auto" w:sz="4"/>
-          <w:insideV w:val="single" w:color="auto" w:sz="4"/>
-        </w:tblBorders>
-      </w:tblPr>
-      <w:tblGrid>
-        <w:gridCol w:w="2600"/>
-        <w:gridCol w:w="6426"/>
-      </w:tblGrid>
-      <w:tr>
-        <w:trPr>
-          <w:tblHeader/>
-        </w:trPr>
-        <w:tc>
-          <w:tcPr>
-            <w:tcW w:type="dxa" w:w="2600"/>
-            <w:tcBorders>
-              <w:top w:val="single" w:color="BFBFBF" w:sz="4"/>
-              <w:left w:val="single" w:color="BFBFBF" w:sz="4"/>
-              <w:bottom w:val="single" w:color="BFBFBF" w:sz="4"/>
-              <w:right w:val="single" w:color="BFBFBF" w:sz="4"/>
-            </w:tcBorders>
-            <w:shd w:fill="DCE6F2" w:color="auto" w:val="clear"/>
-            <w:tcMar>
-              <w:top w:type="dxa" w:w="80"/>
-              <w:left w:type="dxa" w:w="120"/>
-              <w:bottom w:type="dxa" w:w="80"/>
-              <w:right w:type="dxa" w:w="120"/>
-            </w:tcMar>
-          </w:tcPr>
-          <w:p>
-            <w:r>
-              <w:rPr>
-                <w:b/>
-                <w:bCs/>
-                <w:i w:val="false"/>
-                <w:iCs w:val="false"/>
-                <w:sz w:val="20"/>
-                <w:szCs w:val="20"/>
-              </w:rPr>
-              <w:t xml:space="preserve">Perkara</w:t>
-            </w:r>
-          </w:p>
-        </w:tc>
-        <w:tc>
-          <w:tcPr>
-            <w:tcW w:type="dxa" w:w="6426"/>
-            <w:tcBorders>
-              <w:top w:val="single" w:color="BFBFBF" w:sz="4"/>
-              <w:left w:val="single" w:color="BFBFBF" w:sz="4"/>
-              <w:bottom w:val="single" w:color="BFBFBF" w:sz="4"/>
-              <w:right w:val="single" w:color="BFBFBF" w:sz="4"/>
-            </w:tcBorders>
-            <w:shd w:fill="DCE6F2" w:color="auto" w:val="clear"/>
-            <w:tcMar>
-              <w:top w:type="dxa" w:w="80"/>
-              <w:left w:type="dxa" w:w="120"/>
-              <w:bottom w:type="dxa" w:w="80"/>
-              <w:right w:type="dxa" w:w="120"/>
-            </w:tcMar>
-          </w:tcPr>
-          <w:p>
-            <w:r>
-              <w:rPr>
-                <w:b/>
-                <w:bCs/>
-                <w:i w:val="false"/>
-                <w:iCs w:val="false"/>
-                <w:sz w:val="20"/>
-                <w:szCs w:val="20"/>
-              </w:rPr>
-              <w:t xml:space="preserve">Butiran</w:t>
-            </w:r>
-          </w:p>
-        </w:tc>
-      </w:tr>
-      <w:tr>
-        <w:trPr>
-          <w:cantSplit/>
-        </w:trPr>
-        <w:tc>
-          <w:tcPr>
-            <w:tcW w:type="dxa" w:w="2600"/>
-            <w:tcBorders>
-              <w:top w:val="single" w:color="BFBFBF" w:sz="4"/>
-              <w:left w:val="single" w:color="BFBFBF" w:sz="4"/>
-              <w:bottom w:val="single" w:color="BFBFBF" w:sz="4"/>
-              <w:right w:val="single" w:color="BFBFBF" w:sz="4"/>
-            </w:tcBorders>
-            <w:tcMar>
-              <w:top w:type="dxa" w:w="80"/>
-              <w:left w:type="dxa" w:w="120"/>
-              <w:bottom w:type="dxa" w:w="80"/>
-              <w:right w:type="dxa" w:w="120"/>
-            </w:tcMar>
-          </w:tcPr>
-          <w:p>
-            <w:r>
-              <w:rPr>
-                <w:b w:val="false"/>
-                <w:bCs w:val="false"/>
-                <w:sz w:val="20"/>
-                <w:szCs w:val="20"/>
-              </w:rPr>
-              <w:t xml:space="preserve">Tempoh</w:t>
-            </w:r>
-          </w:p>
-        </w:tc>
-        <w:tc>
-          <w:tcPr>
-            <w:tcW w:type="dxa" w:w="6426"/>
-            <w:tcBorders>
-              <w:top w:val="single" w:color="BFBFBF" w:sz="4"/>
-              <w:left w:val="single" w:color="BFBFBF" w:sz="4"/>
-              <w:bottom w:val="single" w:color="BFBFBF" w:sz="4"/>
-              <w:right w:val="single" w:color="BFBFBF" w:sz="4"/>
-            </w:tcBorders>
-            <w:tcMar>
-              <w:top w:type="dxa" w:w="80"/>
-              <w:left w:type="dxa" w:w="120"/>
-              <w:bottom w:type="dxa" w:w="80"/>
-              <w:right w:type="dxa" w:w="120"/>
-            </w:tcMar>
-          </w:tcPr>
-          <w:p>
-            <w:r>
-              <w:rPr>
-                <w:highlight w:val="yellow"/>
-                <w:highlightCs w:val="yellow"/>
-              </w:rPr>
-              <w:t xml:space="preserve">[tarikh mula] hingga [tarikh tamat]</w:t>
-            </w:r>
-          </w:p>
-        </w:tc>
-      </w:tr>
-      <w:tr>
-        <w:trPr>
-          <w:cantSplit/>
-        </w:trPr>
-        <w:tc>
-          <w:tcPr>
-            <w:tcW w:type="dxa" w:w="2600"/>
-            <w:tcBorders>
-              <w:top w:val="single" w:color="BFBFBF" w:sz="4"/>
-              <w:left w:val="single" w:color="BFBFBF" w:sz="4"/>
-              <w:bottom w:val="single" w:color="BFBFBF" w:sz="4"/>
-              <w:right w:val="single" w:color="BFBFBF" w:sz="4"/>
-            </w:tcBorders>
-            <w:tcMar>
-              <w:top w:type="dxa" w:w="80"/>
-              <w:left w:type="dxa" w:w="120"/>
-              <w:bottom w:type="dxa" w:w="80"/>
-              <w:right w:type="dxa" w:w="120"/>
-            </w:tcMar>
-          </w:tcPr>
-          <w:p>
-            <w:r>
-              <w:rPr>
-                <w:b w:val="false"/>
-                <w:bCs w:val="false"/>
-                <w:sz w:val="20"/>
-                <w:szCs w:val="20"/>
-              </w:rPr>
-              <w:t xml:space="preserve">Platform utama</w:t>
-            </w:r>
-          </w:p>
-        </w:tc>
-        <w:tc>
-          <w:tcPr>
-            <w:tcW w:type="dxa" w:w="6426"/>
-            <w:tcBorders>
-              <w:top w:val="single" w:color="BFBFBF" w:sz="4"/>
-              <w:left w:val="single" w:color="BFBFBF" w:sz="4"/>
-              <w:bottom w:val="single" w:color="BFBFBF" w:sz="4"/>
-              <w:right w:val="single" w:color="BFBFBF" w:sz="4"/>
-            </w:tcBorders>
-            <w:tcMar>
-              <w:top w:type="dxa" w:w="80"/>
-              <w:left w:type="dxa" w:w="120"/>
-              <w:bottom w:type="dxa" w:w="80"/>
-              <w:right w:type="dxa" w:w="120"/>
-            </w:tcMar>
-          </w:tcPr>
-          <w:p>
-            <w:r>
-              <w:rPr>
-                <w:b w:val="false"/>
-                <w:bCs w:val="false"/>
-                <w:sz w:val="20"/>
-                <w:szCs w:val="20"/>
-              </w:rPr>
-              <w:t xml:space="preserve">WhatsApp Business: Status, senarai siaran, kumpulan, mesej automatik</w:t>
-            </w:r>
-          </w:p>
-        </w:tc>
-      </w:tr>
-      <w:tr>
-        <w:trPr>
-          <w:cantSplit/>
-        </w:trPr>
-        <w:tc>
-          <w:tcPr>
-            <w:tcW w:type="dxa" w:w="2600"/>
-            <w:tcBorders>
-              <w:top w:val="single" w:color="BFBFBF" w:sz="4"/>
-              <w:left w:val="single" w:color="BFBFBF" w:sz="4"/>
-              <w:bottom w:val="single" w:color="BFBFBF" w:sz="4"/>
-              <w:right w:val="single" w:color="BFBFBF" w:sz="4"/>
-            </w:tcBorders>
-            <w:tcMar>
-              <w:top w:type="dxa" w:w="80"/>
-              <w:left w:type="dxa" w:w="120"/>
-              <w:bottom w:type="dxa" w:w="80"/>
-              <w:right w:type="dxa" w:w="120"/>
-            </w:tcMar>
-          </w:tcPr>
-          <w:p>
-            <w:r>
-              <w:rPr>
-                <w:b w:val="false"/>
-                <w:bCs w:val="false"/>
-                <w:sz w:val="20"/>
-                <w:szCs w:val="20"/>
-              </w:rPr>
-              <w:t xml:space="preserve">Platform sokongan</w:t>
-            </w:r>
-          </w:p>
-        </w:tc>
-        <w:tc>
-          <w:tcPr>
-            <w:tcW w:type="dxa" w:w="6426"/>
-            <w:tcBorders>
-              <w:top w:val="single" w:color="BFBFBF" w:sz="4"/>
-              <w:left w:val="single" w:color="BFBFBF" w:sz="4"/>
-              <w:bottom w:val="single" w:color="BFBFBF" w:sz="4"/>
-              <w:right w:val="single" w:color="BFBFBF" w:sz="4"/>
-            </w:tcBorders>
-            <w:tcMar>
-              <w:top w:type="dxa" w:w="80"/>
-              <w:left w:type="dxa" w:w="120"/>
-              <w:bottom w:type="dxa" w:w="80"/>
-              <w:right w:type="dxa" w:w="120"/>
-            </w:tcMar>
-          </w:tcPr>
-          <w:p>
-            <w:r>
-              <w:rPr>
-                <w:highlight w:val="yellow"/>
-                <w:highlightCs w:val="yellow"/>
-              </w:rPr>
-              <w:t xml:space="preserve">[TikTok / Instagram / Facebook: padam yang tidak berkenaan]</w:t>
-            </w:r>
-          </w:p>
-        </w:tc>
-      </w:tr>
-      <w:tr>
-        <w:trPr>
-          <w:cantSplit/>
-        </w:trPr>
-        <w:tc>
-          <w:tcPr>
-            <w:tcW w:type="dxa" w:w="2600"/>
-            <w:tcBorders>
-              <w:top w:val="single" w:color="BFBFBF" w:sz="4"/>
-              <w:left w:val="single" w:color="BFBFBF" w:sz="4"/>
-              <w:bottom w:val="single" w:color="BFBFBF" w:sz="4"/>
-              <w:right w:val="single" w:color="BFBFBF" w:sz="4"/>
-            </w:tcBorders>
-            <w:tcMar>
-              <w:top w:type="dxa" w:w="80"/>
-              <w:left w:type="dxa" w:w="120"/>
-              <w:bottom w:type="dxa" w:w="80"/>
-              <w:right w:type="dxa" w:w="120"/>
-            </w:tcMar>
-          </w:tcPr>
-          <w:p>
-            <w:r>
-              <w:rPr>
-                <w:b w:val="false"/>
-                <w:bCs w:val="false"/>
-                <w:sz w:val="20"/>
-                <w:szCs w:val="20"/>
-              </w:rPr>
-              <w:t xml:space="preserve">Sasaran pasaran</w:t>
-            </w:r>
-          </w:p>
-        </w:tc>
-        <w:tc>
-          <w:tcPr>
-            <w:tcW w:type="dxa" w:w="6426"/>
-            <w:tcBorders>
-              <w:top w:val="single" w:color="BFBFBF" w:sz="4"/>
-              <w:left w:val="single" w:color="BFBFBF" w:sz="4"/>
-              <w:bottom w:val="single" w:color="BFBFBF" w:sz="4"/>
-              <w:right w:val="single" w:color="BFBFBF" w:sz="4"/>
-            </w:tcBorders>
-            <w:tcMar>
-              <w:top w:type="dxa" w:w="80"/>
-              <w:left w:type="dxa" w:w="120"/>
-              <w:bottom w:type="dxa" w:w="80"/>
-              <w:right w:type="dxa" w:w="120"/>
-            </w:tcMar>
-          </w:tcPr>
-          <w:p>
-            <w:r>
-              <w:rPr>
-                <w:b w:val="false"/>
-                <w:bCs w:val="false"/>
-                <w:sz w:val="20"/>
-                <w:szCs w:val="20"/>
-              </w:rPr>
-              <w:t xml:space="preserve">Ibu bapa, guru prasekolah, pengusaha tadika dan taska</w:t>
-            </w:r>
-          </w:p>
-        </w:tc>
-      </w:tr>
-    </w:tbl>
-    <w:p>
-      <w:pPr>
-        <w:pStyle w:val="Heading1"/>
-      </w:pPr>
-      <w:r>
-        <w:t xml:space="preserve">5.0 AKTIVITI PEMASARAN YANG DIJALANKAN</w:t>
-      </w:r>
-    </w:p>
-    <w:p>
-      <w:pPr>
-        <w:pStyle w:val="Heading2"/>
-      </w:pPr>
-      <w:r>
-        <w:t xml:space="preserve">5.1 Penyediaan Bahan Promosi</w:t>
-      </w:r>
-    </w:p>
-    <w:p>
-      <w:pPr>
-        <w:spacing w:after="160" w:line="360"/>
-        <w:jc w:val="both"/>
-      </w:pPr>
-      <w:r>
-        <w:t xml:space="preserve">Saya telah menyediakan bahan promosi berikut sebelum kempen dimulakan:</w:t>
-      </w:r>
-    </w:p>
-    <w:tbl>
-      <w:tblPr>
-        <w:tblW w:type="dxa" w:w="9026"/>
-        <w:tblBorders>
-          <w:top w:val="single" w:color="auto" w:sz="4"/>
-          <w:left w:val="single" w:color="auto" w:sz="4"/>
-          <w:bottom w:val="single" w:color="auto" w:sz="4"/>
-          <w:right w:val="single" w:color="auto" w:sz="4"/>
-          <w:insideH w:val="single" w:color="auto" w:sz="4"/>
-          <w:insideV w:val="single" w:color="auto" w:sz="4"/>
-        </w:tblBorders>
-      </w:tblPr>
-      <w:tblGrid>
-        <w:gridCol w:w="2200"/>
-        <w:gridCol w:w="4426"/>
-        <w:gridCol w:w="2400"/>
-      </w:tblGrid>
-      <w:tr>
-        <w:trPr>
-          <w:tblHeader/>
-        </w:trPr>
-        <w:tc>
-          <w:tcPr>
-            <w:tcW w:type="dxa" w:w="2200"/>
-            <w:tcBorders>
-              <w:top w:val="single" w:color="BFBFBF" w:sz="4"/>
-              <w:left w:val="single" w:color="BFBFBF" w:sz="4"/>
-              <w:bottom w:val="single" w:color="BFBFBF" w:sz="4"/>
-              <w:right w:val="single" w:color="BFBFBF" w:sz="4"/>
-            </w:tcBorders>
-            <w:shd w:fill="DCE6F2" w:color="auto" w:val="clear"/>
-            <w:tcMar>
-              <w:top w:type="dxa" w:w="80"/>
-              <w:left w:type="dxa" w:w="120"/>
-              <w:bottom w:type="dxa" w:w="80"/>
-              <w:right w:type="dxa" w:w="120"/>
-            </w:tcMar>
-          </w:tcPr>
-          <w:p>
-            <w:r>
-              <w:rPr>
-                <w:b/>
-                <w:bCs/>
-                <w:i w:val="false"/>
-                <w:iCs w:val="false"/>
-                <w:sz w:val="20"/>
-                <w:szCs w:val="20"/>
-              </w:rPr>
-              <w:t xml:space="preserve">Bahan</w:t>
-            </w:r>
-          </w:p>
-        </w:tc>
-        <w:tc>
-          <w:tcPr>
-            <w:tcW w:type="dxa" w:w="4426"/>
-            <w:tcBorders>
-              <w:top w:val="single" w:color="BFBFBF" w:sz="4"/>
-              <w:left w:val="single" w:color="BFBFBF" w:sz="4"/>
-              <w:bottom w:val="single" w:color="BFBFBF" w:sz="4"/>
-              <w:right w:val="single" w:color="BFBFBF" w:sz="4"/>
-            </w:tcBorders>
-            <w:shd w:fill="DCE6F2" w:color="auto" w:val="clear"/>
-            <w:tcMar>
-              <w:top w:type="dxa" w:w="80"/>
-              <w:left w:type="dxa" w:w="120"/>
-              <w:bottom w:type="dxa" w:w="80"/>
-              <w:right w:type="dxa" w:w="120"/>
-            </w:tcMar>
-          </w:tcPr>
-          <w:p>
-            <w:r>
-              <w:rPr>
-                <w:b/>
-                <w:bCs/>
-                <w:i w:val="false"/>
-                <w:iCs w:val="false"/>
-                <w:sz w:val="20"/>
-                <w:szCs w:val="20"/>
-              </w:rPr>
-              <w:t xml:space="preserve">Penerangan</w:t>
-            </w:r>
-          </w:p>
-        </w:tc>
-        <w:tc>
-          <w:tcPr>
-            <w:tcW w:type="dxa" w:w="2400"/>
-            <w:tcBorders>
-              <w:top w:val="single" w:color="BFBFBF" w:sz="4"/>
-              <w:left w:val="single" w:color="BFBFBF" w:sz="4"/>
-              <w:bottom w:val="single" w:color="BFBFBF" w:sz="4"/>
-              <w:right w:val="single" w:color="BFBFBF" w:sz="4"/>
-            </w:tcBorders>
-            <w:shd w:fill="DCE6F2" w:color="auto" w:val="clear"/>
-            <w:tcMar>
-              <w:top w:type="dxa" w:w="80"/>
-              <w:left w:type="dxa" w:w="120"/>
-              <w:bottom w:type="dxa" w:w="80"/>
-              <w:right w:type="dxa" w:w="120"/>
-            </w:tcMar>
-          </w:tcPr>
-          <w:p>
-            <w:r>
-              <w:rPr>
-                <w:b/>
-                <w:bCs/>
-                <w:i w:val="false"/>
-                <w:iCs w:val="false"/>
-                <w:sz w:val="20"/>
-                <w:szCs w:val="20"/>
-              </w:rPr>
-              <w:t xml:space="preserve">Platform</w:t>
-            </w:r>
-          </w:p>
-        </w:tc>
-      </w:tr>
-      <w:tr>
-        <w:trPr>
-          <w:cantSplit/>
-        </w:trPr>
-        <w:tc>
-          <w:tcPr>
-            <w:tcW w:type="dxa" w:w="2200"/>
-            <w:tcBorders>
-              <w:top w:val="single" w:color="BFBFBF" w:sz="4"/>
-              <w:left w:val="single" w:color="BFBFBF" w:sz="4"/>
-              <w:bottom w:val="single" w:color="BFBFBF" w:sz="4"/>
-              <w:right w:val="single" w:color="BFBFBF" w:sz="4"/>
-            </w:tcBorders>
-            <w:tcMar>
-              <w:top w:type="dxa" w:w="80"/>
-              <w:left w:type="dxa" w:w="120"/>
-              <w:bottom w:type="dxa" w:w="80"/>
-              <w:right w:type="dxa" w:w="120"/>
-            </w:tcMar>
-          </w:tcPr>
-          <w:p>
-            <w:r>
-              <w:rPr>
-                <w:b w:val="false"/>
-                <w:bCs w:val="false"/>
-                <w:sz w:val="20"/>
-                <w:szCs w:val="20"/>
-              </w:rPr>
-              <w:t xml:space="preserve">Poster jualan</w:t>
-            </w:r>
-          </w:p>
-        </w:tc>
-        <w:tc>
-          <w:tcPr>
-            <w:tcW w:type="dxa" w:w="4426"/>
-            <w:tcBorders>
-              <w:top w:val="single" w:color="BFBFBF" w:sz="4"/>
-              <w:left w:val="single" w:color="BFBFBF" w:sz="4"/>
-              <w:bottom w:val="single" w:color="BFBFBF" w:sz="4"/>
-              <w:right w:val="single" w:color="BFBFBF" w:sz="4"/>
-            </w:tcBorders>
-            <w:tcMar>
-              <w:top w:type="dxa" w:w="80"/>
-              <w:left w:type="dxa" w:w="120"/>
-              <w:bottom w:type="dxa" w:w="80"/>
-              <w:right w:type="dxa" w:w="120"/>
-            </w:tcMar>
-          </w:tcPr>
-          <w:p>
-            <w:r>
-              <w:rPr>
-                <w:b w:val="false"/>
-                <w:bCs w:val="false"/>
-                <w:sz w:val="20"/>
-                <w:szCs w:val="20"/>
-              </w:rPr>
-              <w:t xml:space="preserve">Poster 2160 x 2700 piksel yang memaparkan 10 kulit buku, harga dan nombor WhatsApp</w:t>
-            </w:r>
-          </w:p>
-        </w:tc>
-        <w:tc>
-          <w:tcPr>
-            <w:tcW w:type="dxa" w:w="2400"/>
-            <w:tcBorders>
-              <w:top w:val="single" w:color="BFBFBF" w:sz="4"/>
-              <w:left w:val="single" w:color="BFBFBF" w:sz="4"/>
-              <w:bottom w:val="single" w:color="BFBFBF" w:sz="4"/>
-              <w:right w:val="single" w:color="BFBFBF" w:sz="4"/>
-            </w:tcBorders>
-            <w:tcMar>
-              <w:top w:type="dxa" w:w="80"/>
-              <w:left w:type="dxa" w:w="120"/>
-              <w:bottom w:type="dxa" w:w="80"/>
-              <w:right w:type="dxa" w:w="120"/>
-            </w:tcMar>
-          </w:tcPr>
-          <w:p>
-            <w:r>
-              <w:rPr>
-                <w:b w:val="false"/>
-                <w:bCs w:val="false"/>
-                <w:sz w:val="20"/>
-                <w:szCs w:val="20"/>
-              </w:rPr>
-              <w:t xml:space="preserve">Status WhatsApp, kumpulan, media sosial</w:t>
-            </w:r>
-          </w:p>
-        </w:tc>
-      </w:tr>
-      <w:tr>
-        <w:trPr>
-          <w:cantSplit/>
-        </w:trPr>
-        <w:tc>
-          <w:tcPr>
-            <w:tcW w:type="dxa" w:w="2200"/>
-            <w:tcBorders>
-              <w:top w:val="single" w:color="BFBFBF" w:sz="4"/>
-              <w:left w:val="single" w:color="BFBFBF" w:sz="4"/>
-              <w:bottom w:val="single" w:color="BFBFBF" w:sz="4"/>
-              <w:right w:val="single" w:color="BFBFBF" w:sz="4"/>
-            </w:tcBorders>
-            <w:tcMar>
-              <w:top w:type="dxa" w:w="80"/>
-              <w:left w:type="dxa" w:w="120"/>
-              <w:bottom w:type="dxa" w:w="80"/>
-              <w:right w:type="dxa" w:w="120"/>
-            </w:tcMar>
-          </w:tcPr>
-          <w:p>
-            <w:r>
-              <w:rPr>
-                <w:b w:val="false"/>
-                <w:bCs w:val="false"/>
-                <w:sz w:val="20"/>
-                <w:szCs w:val="20"/>
-              </w:rPr>
-              <w:t xml:space="preserve">Video promosi</w:t>
-            </w:r>
-          </w:p>
-        </w:tc>
-        <w:tc>
-          <w:tcPr>
-            <w:tcW w:type="dxa" w:w="4426"/>
-            <w:tcBorders>
-              <w:top w:val="single" w:color="BFBFBF" w:sz="4"/>
-              <w:left w:val="single" w:color="BFBFBF" w:sz="4"/>
-              <w:bottom w:val="single" w:color="BFBFBF" w:sz="4"/>
-              <w:right w:val="single" w:color="BFBFBF" w:sz="4"/>
-            </w:tcBorders>
-            <w:tcMar>
-              <w:top w:type="dxa" w:w="80"/>
-              <w:left w:type="dxa" w:w="120"/>
-              <w:bottom w:type="dxa" w:w="80"/>
-              <w:right w:type="dxa" w:w="120"/>
-            </w:tcMar>
-          </w:tcPr>
-          <w:p>
-            <w:r>
-              <w:rPr>
-                <w:b w:val="false"/>
-                <w:bCs w:val="false"/>
-                <w:sz w:val="20"/>
-                <w:szCs w:val="20"/>
-              </w:rPr>
-              <w:t xml:space="preserve">Video menegak 26 saat</w:t>
-            </w:r>
-          </w:p>
-        </w:tc>
-        <w:tc>
-          <w:tcPr>
-            <w:tcW w:type="dxa" w:w="2400"/>
-            <w:tcBorders>
-              <w:top w:val="single" w:color="BFBFBF" w:sz="4"/>
-              <w:left w:val="single" w:color="BFBFBF" w:sz="4"/>
-              <w:bottom w:val="single" w:color="BFBFBF" w:sz="4"/>
-              <w:right w:val="single" w:color="BFBFBF" w:sz="4"/>
-            </w:tcBorders>
-            <w:tcMar>
-              <w:top w:type="dxa" w:w="80"/>
-              <w:left w:type="dxa" w:w="120"/>
-              <w:bottom w:type="dxa" w:w="80"/>
-              <w:right w:type="dxa" w:w="120"/>
-            </w:tcMar>
-          </w:tcPr>
-          <w:p>
-            <w:r>
-              <w:rPr>
-                <w:b w:val="false"/>
-                <w:bCs w:val="false"/>
-                <w:sz w:val="20"/>
-                <w:szCs w:val="20"/>
-              </w:rPr>
-              <w:t xml:space="preserve">Status WhatsApp, TikTok, Reels</w:t>
-            </w:r>
-          </w:p>
-        </w:tc>
-      </w:tr>
-      <w:tr>
-        <w:trPr>
-          <w:cantSplit/>
-        </w:trPr>
-        <w:tc>
-          <w:tcPr>
-            <w:tcW w:type="dxa" w:w="2200"/>
-            <w:tcBorders>
-              <w:top w:val="single" w:color="BFBFBF" w:sz="4"/>
-              <w:left w:val="single" w:color="BFBFBF" w:sz="4"/>
-              <w:bottom w:val="single" w:color="BFBFBF" w:sz="4"/>
-              <w:right w:val="single" w:color="BFBFBF" w:sz="4"/>
-            </w:tcBorders>
-            <w:tcMar>
-              <w:top w:type="dxa" w:w="80"/>
-              <w:left w:type="dxa" w:w="120"/>
-              <w:bottom w:type="dxa" w:w="80"/>
-              <w:right w:type="dxa" w:w="120"/>
-            </w:tcMar>
-          </w:tcPr>
-          <w:p>
-            <w:r>
-              <w:rPr>
-                <w:b w:val="false"/>
-                <w:bCs w:val="false"/>
-                <w:sz w:val="20"/>
-                <w:szCs w:val="20"/>
-              </w:rPr>
-              <w:t xml:space="preserve">Video demo produk</w:t>
-            </w:r>
-          </w:p>
-        </w:tc>
-        <w:tc>
-          <w:tcPr>
-            <w:tcW w:type="dxa" w:w="4426"/>
-            <w:tcBorders>
-              <w:top w:val="single" w:color="BFBFBF" w:sz="4"/>
-              <w:left w:val="single" w:color="BFBFBF" w:sz="4"/>
-              <w:bottom w:val="single" w:color="BFBFBF" w:sz="4"/>
-              <w:right w:val="single" w:color="BFBFBF" w:sz="4"/>
-            </w:tcBorders>
-            <w:tcMar>
-              <w:top w:type="dxa" w:w="80"/>
-              <w:left w:type="dxa" w:w="120"/>
-              <w:bottom w:type="dxa" w:w="80"/>
-              <w:right w:type="dxa" w:w="120"/>
-            </w:tcMar>
-          </w:tcPr>
-          <w:p>
-            <w:r>
-              <w:rPr>
-                <w:b w:val="false"/>
-                <w:bCs w:val="false"/>
-                <w:sz w:val="20"/>
-                <w:szCs w:val="20"/>
-              </w:rPr>
-              <w:t xml:space="preserve">Video menegak 31 saat yang menunjukkan isi buku dan cara penggunaan</w:t>
-            </w:r>
-          </w:p>
-        </w:tc>
-        <w:tc>
-          <w:tcPr>
-            <w:tcW w:type="dxa" w:w="2400"/>
-            <w:tcBorders>
-              <w:top w:val="single" w:color="BFBFBF" w:sz="4"/>
-              <w:left w:val="single" w:color="BFBFBF" w:sz="4"/>
-              <w:bottom w:val="single" w:color="BFBFBF" w:sz="4"/>
-              <w:right w:val="single" w:color="BFBFBF" w:sz="4"/>
-            </w:tcBorders>
-            <w:tcMar>
-              <w:top w:type="dxa" w:w="80"/>
-              <w:left w:type="dxa" w:w="120"/>
-              <w:bottom w:type="dxa" w:w="80"/>
-              <w:right w:type="dxa" w:w="120"/>
-            </w:tcMar>
-          </w:tcPr>
-          <w:p>
-            <w:r>
-              <w:rPr>
-                <w:b w:val="false"/>
-                <w:bCs w:val="false"/>
-                <w:sz w:val="20"/>
-                <w:szCs w:val="20"/>
-              </w:rPr>
-              <w:t xml:space="preserve">Status WhatsApp, TikTok, Reels</w:t>
-            </w:r>
-          </w:p>
-        </w:tc>
-      </w:tr>
-      <w:tr>
-        <w:trPr>
-          <w:cantSplit/>
-        </w:trPr>
-        <w:tc>
-          <w:tcPr>
-            <w:tcW w:type="dxa" w:w="2200"/>
-            <w:tcBorders>
-              <w:top w:val="single" w:color="BFBFBF" w:sz="4"/>
-              <w:left w:val="single" w:color="BFBFBF" w:sz="4"/>
-              <w:bottom w:val="single" w:color="BFBFBF" w:sz="4"/>
-              <w:right w:val="single" w:color="BFBFBF" w:sz="4"/>
-            </w:tcBorders>
-            <w:tcMar>
-              <w:top w:type="dxa" w:w="80"/>
-              <w:left w:type="dxa" w:w="120"/>
-              <w:bottom w:type="dxa" w:w="80"/>
-              <w:right w:type="dxa" w:w="120"/>
-            </w:tcMar>
-          </w:tcPr>
-          <w:p>
-            <w:r>
-              <w:rPr>
-                <w:b w:val="false"/>
-                <w:bCs w:val="false"/>
-                <w:sz w:val="20"/>
-                <w:szCs w:val="20"/>
-              </w:rPr>
-              <w:t xml:space="preserve">Kapsyen jualan</w:t>
-            </w:r>
-          </w:p>
-        </w:tc>
-        <w:tc>
-          <w:tcPr>
-            <w:tcW w:type="dxa" w:w="4426"/>
-            <w:tcBorders>
-              <w:top w:val="single" w:color="BFBFBF" w:sz="4"/>
-              <w:left w:val="single" w:color="BFBFBF" w:sz="4"/>
-              <w:bottom w:val="single" w:color="BFBFBF" w:sz="4"/>
-              <w:right w:val="single" w:color="BFBFBF" w:sz="4"/>
-            </w:tcBorders>
-            <w:tcMar>
-              <w:top w:type="dxa" w:w="80"/>
-              <w:left w:type="dxa" w:w="120"/>
-              <w:bottom w:type="dxa" w:w="80"/>
-              <w:right w:type="dxa" w:w="120"/>
-            </w:tcMar>
-          </w:tcPr>
-          <w:p>
-            <w:r>
-              <w:rPr>
-                <w:b w:val="false"/>
-                <w:bCs w:val="false"/>
-                <w:sz w:val="20"/>
-                <w:szCs w:val="20"/>
-              </w:rPr>
-              <w:t xml:space="preserve">Teks promosi dengan senarai siri, harga dan hashtag</w:t>
-            </w:r>
-          </w:p>
-        </w:tc>
-        <w:tc>
-          <w:tcPr>
-            <w:tcW w:type="dxa" w:w="2400"/>
-            <w:tcBorders>
-              <w:top w:val="single" w:color="BFBFBF" w:sz="4"/>
-              <w:left w:val="single" w:color="BFBFBF" w:sz="4"/>
-              <w:bottom w:val="single" w:color="BFBFBF" w:sz="4"/>
-              <w:right w:val="single" w:color="BFBFBF" w:sz="4"/>
-            </w:tcBorders>
-            <w:tcMar>
-              <w:top w:type="dxa" w:w="80"/>
-              <w:left w:type="dxa" w:w="120"/>
-              <w:bottom w:type="dxa" w:w="80"/>
-              <w:right w:type="dxa" w:w="120"/>
-            </w:tcMar>
-          </w:tcPr>
-          <w:p>
-            <w:r>
-              <w:rPr>
-                <w:b w:val="false"/>
-                <w:bCs w:val="false"/>
-                <w:sz w:val="20"/>
-                <w:szCs w:val="20"/>
-              </w:rPr>
-              <w:t xml:space="preserve">Semua platform</w:t>
-            </w:r>
-          </w:p>
-        </w:tc>
-      </w:tr>
-      <w:tr>
-        <w:trPr>
-          <w:cantSplit/>
-        </w:trPr>
-        <w:tc>
-          <w:tcPr>
-            <w:tcW w:type="dxa" w:w="2200"/>
-            <w:tcBorders>
-              <w:top w:val="single" w:color="BFBFBF" w:sz="4"/>
-              <w:left w:val="single" w:color="BFBFBF" w:sz="4"/>
-              <w:bottom w:val="single" w:color="BFBFBF" w:sz="4"/>
-              <w:right w:val="single" w:color="BFBFBF" w:sz="4"/>
-            </w:tcBorders>
-            <w:tcMar>
-              <w:top w:type="dxa" w:w="80"/>
-              <w:left w:type="dxa" w:w="120"/>
-              <w:bottom w:type="dxa" w:w="80"/>
-              <w:right w:type="dxa" w:w="120"/>
-            </w:tcMar>
-          </w:tcPr>
-          <w:p>
-            <w:r>
-              <w:rPr>
-                <w:b w:val="false"/>
-                <w:bCs w:val="false"/>
-                <w:sz w:val="20"/>
-                <w:szCs w:val="20"/>
-              </w:rPr>
-              <w:t xml:space="preserve">Mesej auto-balas</w:t>
-            </w:r>
-          </w:p>
-        </w:tc>
-        <w:tc>
-          <w:tcPr>
-            <w:tcW w:type="dxa" w:w="4426"/>
-            <w:tcBorders>
-              <w:top w:val="single" w:color="BFBFBF" w:sz="4"/>
-              <w:left w:val="single" w:color="BFBFBF" w:sz="4"/>
-              <w:bottom w:val="single" w:color="BFBFBF" w:sz="4"/>
-              <w:right w:val="single" w:color="BFBFBF" w:sz="4"/>
-            </w:tcBorders>
-            <w:tcMar>
-              <w:top w:type="dxa" w:w="80"/>
-              <w:left w:type="dxa" w:w="120"/>
-              <w:bottom w:type="dxa" w:w="80"/>
-              <w:right w:type="dxa" w:w="120"/>
-            </w:tcMar>
-          </w:tcPr>
-          <w:p>
-            <w:r>
-              <w:rPr>
-                <w:b w:val="false"/>
-                <w:bCs w:val="false"/>
-                <w:sz w:val="20"/>
-                <w:szCs w:val="20"/>
-              </w:rPr>
-              <w:t xml:space="preserve">Mesej sapaan, mesej tidak hadir dan 7 balasan pantas</w:t>
-            </w:r>
-          </w:p>
-        </w:tc>
-        <w:tc>
-          <w:tcPr>
-            <w:tcW w:type="dxa" w:w="2400"/>
-            <w:tcBorders>
-              <w:top w:val="single" w:color="BFBFBF" w:sz="4"/>
-              <w:left w:val="single" w:color="BFBFBF" w:sz="4"/>
-              <w:bottom w:val="single" w:color="BFBFBF" w:sz="4"/>
-              <w:right w:val="single" w:color="BFBFBF" w:sz="4"/>
-            </w:tcBorders>
-            <w:tcMar>
-              <w:top w:type="dxa" w:w="80"/>
-              <w:left w:type="dxa" w:w="120"/>
-              <w:bottom w:type="dxa" w:w="80"/>
-              <w:right w:type="dxa" w:w="120"/>
-            </w:tcMar>
-          </w:tcPr>
-          <w:p>
-            <w:r>
-              <w:rPr>
-                <w:b w:val="false"/>
-                <w:bCs w:val="false"/>
-                <w:sz w:val="20"/>
-                <w:szCs w:val="20"/>
-              </w:rPr>
-              <w:t xml:space="preserve">WhatsApp Business</w:t>
-            </w:r>
-          </w:p>
-        </w:tc>
-      </w:tr>
-    </w:tbl>
-    <w:p>
-      <w:pPr>
-        <w:spacing w:after="80"/>
-      </w:pPr>
-    </w:p>
-    <w:p>
-      <w:pPr>
-        <w:spacing w:after="120"/>
-        <w:jc w:val="center"/>
-      </w:pPr>
-      <w:r>
-        <w:drawing>
-          <wp:inline distT="0" distB="0" distL="0" distR="0">
-            <wp:extent cx="3143250" cy="3933825"/>
-            <wp:effectExtent t="0" r="0" b="0" l="0"/>
-            <wp:docPr id="1" name="" descr="" title=""/>
-            <wp:cNvGraphicFramePr>
-              <a:graphicFrameLocks xmlns:a="http://schemas.openxmlformats.org/drawingml/2006/main" noChangeAspect="1"/>
-            </wp:cNvGraphicFramePr>
-            <a:graphic xmlns:a="http://schemas.openxmlformats.org/drawingml/2006/main">
-              <a:graphicData uri="http://schemas.openxmlformats.org/drawingml/2006/picture">
-                <pic:pic xmlns:pic="http://schemas.openxmlformats.org/drawingml/2006/picture">
-                  <pic:nvPicPr>
-                    <pic:cNvPr id="0" name="" descr=""/>
-                    <pic:cNvPicPr>
-                      <a:picLocks noChangeAspect="1" noChangeArrowheads="1"/>
-                    </pic:cNvPicPr>
-                  </pic:nvPicPr>
-                  <pic:blipFill>
-                    <a:blip r:embed="rId11" cstate="none"/>
-                    <a:srcRect/>
-                    <a:stretch>
-                      <a:fillRect/>
-                    </a:stretch>
-                  </pic:blipFill>
-                  <pic:spPr bwMode="auto">
-                    <a:xfrm>
-                      <a:off x="0" y="0"/>
                       <a:ext cx="3143250" cy="3933825"/>
                     </a:xfrm>
                     <a:prstGeom prst="rect">
@@ -1992,6 +1949,62 @@
         <w:gridCol w:w="3008"/>
       </w:tblGrid>
       <w:tr>
+        <w:tc>
+          <w:tcPr>
+            <w:tcW w:type="dxa" w:w="3008"/>
+            <w:tcBorders>
+              <w:top w:val="none" w:color="FFFFFF" w:sz="0"/>
+              <w:left w:val="none" w:color="FFFFFF" w:sz="0"/>
+              <w:bottom w:val="none" w:color="FFFFFF" w:sz="0"/>
+              <w:right w:val="none" w:color="FFFFFF" w:sz="0"/>
+            </w:tcBorders>
+          </w:tcPr>
+          <w:p>
+            <w:pPr>
+              <w:jc w:val="center"/>
+            </w:pPr>
+            <w:r>
+              <w:drawing>
+                <wp:inline distT="0" distB="0" distL="0" distR="0">
+                  <wp:extent cx="1428750" cy="2543175"/>
+                  <wp:effectExtent t="0" r="0" b="0" l="0"/>
+                  <wp:docPr id="1" name="" descr="" title=""/>
+                  <wp:cNvGraphicFramePr>
+                    <a:graphicFrameLocks xmlns:a="http://schemas.openxmlformats.org/drawingml/2006/main" noChangeAspect="1"/>
+                  </wp:cNvGraphicFramePr>
+                  <a:graphic xmlns:a="http://schemas.openxmlformats.org/drawingml/2006/main">
+                    <a:graphicData uri="http://schemas.openxmlformats.org/drawingml/2006/picture">
+                      <pic:pic xmlns:pic="http://schemas.openxmlformats.org/drawingml/2006/picture">
+                        <pic:nvPicPr>
+                          <pic:cNvPr id="0" name="" descr=""/>
+                          <pic:cNvPicPr>
+                            <a:picLocks noChangeAspect="1" noChangeArrowheads="1"/>
+                          </pic:cNvPicPr>
+                        </pic:nvPicPr>
+                        <pic:blipFill>
+                          <a:blip r:embed="rId11" cstate="none"/>
+                          <a:srcRect/>
+                          <a:stretch>
+                            <a:fillRect/>
+                          </a:stretch>
+                        </pic:blipFill>
+                        <pic:spPr bwMode="auto">
+                          <a:xfrm>
+                            <a:off x="0" y="0"/>
+                            <a:ext cx="1428750" cy="2543175"/>
+                          </a:xfrm>
+                          <a:prstGeom prst="rect">
+                            <a:avLst/>
+                          </a:prstGeom>
+                        </pic:spPr>
+                      </pic:pic>
+                    </a:graphicData>
+                  </a:graphic>
+                </wp:inline>
+              </w:drawing>
+            </w:r>
+          </w:p>
+        </w:tc>
         <w:tc>
           <w:tcPr>
             <w:tcW w:type="dxa" w:w="3008"/>
@@ -2104,62 +2117,6 @@
             </w:r>
           </w:p>
         </w:tc>
-        <w:tc>
-          <w:tcPr>
-            <w:tcW w:type="dxa" w:w="3008"/>
-            <w:tcBorders>
-              <w:top w:val="none" w:color="FFFFFF" w:sz="0"/>
-              <w:left w:val="none" w:color="FFFFFF" w:sz="0"/>
-              <w:bottom w:val="none" w:color="FFFFFF" w:sz="0"/>
-              <w:right w:val="none" w:color="FFFFFF" w:sz="0"/>
-            </w:tcBorders>
-          </w:tcPr>
-          <w:p>
-            <w:pPr>
-              <w:jc w:val="center"/>
-            </w:pPr>
-            <w:r>
-              <w:drawing>
-                <wp:inline distT="0" distB="0" distL="0" distR="0">
-                  <wp:extent cx="1428750" cy="2543175"/>
-                  <wp:effectExtent t="0" r="0" b="0" l="0"/>
-                  <wp:docPr id="1" name="" descr="" title=""/>
-                  <wp:cNvGraphicFramePr>
-                    <a:graphicFrameLocks xmlns:a="http://schemas.openxmlformats.org/drawingml/2006/main" noChangeAspect="1"/>
-                  </wp:cNvGraphicFramePr>
-                  <a:graphic xmlns:a="http://schemas.openxmlformats.org/drawingml/2006/main">
-                    <a:graphicData uri="http://schemas.openxmlformats.org/drawingml/2006/picture">
-                      <pic:pic xmlns:pic="http://schemas.openxmlformats.org/drawingml/2006/picture">
-                        <pic:nvPicPr>
-                          <pic:cNvPr id="0" name="" descr=""/>
-                          <pic:cNvPicPr>
-                            <a:picLocks noChangeAspect="1" noChangeArrowheads="1"/>
-                          </pic:cNvPicPr>
-                        </pic:nvPicPr>
-                        <pic:blipFill>
-                          <a:blip r:embed="rId14" cstate="none"/>
-                          <a:srcRect/>
-                          <a:stretch>
-                            <a:fillRect/>
-                          </a:stretch>
-                        </pic:blipFill>
-                        <pic:spPr bwMode="auto">
-                          <a:xfrm>
-                            <a:off x="0" y="0"/>
-                            <a:ext cx="1428750" cy="2543175"/>
-                          </a:xfrm>
-                          <a:prstGeom prst="rect">
-                            <a:avLst/>
-                          </a:prstGeom>
-                        </pic:spPr>
-                      </pic:pic>
-                    </a:graphicData>
-                  </a:graphic>
-                </wp:inline>
-              </w:drawing>
-            </w:r>
-          </w:p>
-        </w:tc>
       </w:tr>
       <w:tr>
         <w:tc>
@@ -4442,7 +4399,7 @@
                     </pic:cNvPicPr>
                   </pic:nvPicPr>
                   <pic:blipFill>
-                    <a:blip r:embed="rId15" cstate="none"/>
+                    <a:blip r:embed="rId14" cstate="none"/>
                     <a:srcRect/>
                     <a:stretch>
                       <a:fillRect/>

</xml_diff>

<commit_message>
Rewrite the activity report for a personal WhatsApp account
Co-Authored-By: Claude Opus 5.5 <noreply@anthropic.com>
Claude-Session: https://claude.ai/code/session_01SYfUBsrHyLu7Shnz5SqzmU
</commit_message>
<xml_diff>
--- a/laporan/laporan-aktiviti-pemasaran.docx
+++ b/laporan/laporan-aktiviti-pemasaran.docx
@@ -1153,7 +1153,7 @@
                 <w:sz w:val="20"/>
                 <w:szCs w:val="20"/>
               </w:rPr>
-              <w:t xml:space="preserve">WhatsApp Business: Status, senarai siaran, kumpulan, mesej automatik</w:t>
+              <w:t xml:space="preserve">WhatsApp (akaun peribadi): Status, senarai siaran, kumpulan dan chat</w:t>
             </w:r>
           </w:p>
         </w:tc>
@@ -1803,7 +1803,7 @@
                 <w:sz w:val="20"/>
                 <w:szCs w:val="20"/>
               </w:rPr>
-              <w:t xml:space="preserve">Mesej auto-balas</w:t>
+              <w:t xml:space="preserve">Templat mesej balasan</w:t>
             </w:r>
           </w:p>
         </w:tc>
@@ -1831,7 +1831,7 @@
                 <w:sz w:val="20"/>
                 <w:szCs w:val="20"/>
               </w:rPr>
-              <w:t xml:space="preserve">Mesej sapaan, mesej tidak hadir dan 7 balasan pantas</w:t>
+              <w:t xml:space="preserve">Mesej sedia ada untuk salam, harga, cara pembayaran, penghantaran fail dan susulan</w:t>
             </w:r>
           </w:p>
         </w:tc>
@@ -1859,7 +1859,7 @@
                 <w:sz w:val="20"/>
                 <w:szCs w:val="20"/>
               </w:rPr>
-              <w:t xml:space="preserve">WhatsApp Business</w:t>
+              <w:t xml:space="preserve">Chat WhatsApp</w:t>
             </w:r>
           </w:p>
         </w:tc>
@@ -2204,7 +2204,7 @@
         <w:pStyle w:val="Heading2"/>
       </w:pPr>
       <w:r>
-        <w:t xml:space="preserve">5.2 Persediaan Akaun WhatsApp Business</w:t>
+        <w:t xml:space="preserve">5.2 Persediaan Akaun WhatsApp</w:t>
       </w:r>
     </w:p>
     <w:p>
@@ -2213,7 +2213,46 @@
         <w:jc w:val="both"/>
       </w:pPr>
       <w:r>
-        <w:t xml:space="preserve">Saya telah menyediakan akaun WhatsApp Business supaya pertanyaan pelanggan dapat diurus dengan cepat dan teratur. Antara persediaan yang dibuat ialah profil perniagaan, katalog produk, mesej sapaan automatik, mesej tidak hadir, balasan pantas dan label pelanggan.</w:t>
+        <w:t xml:space="preserve">Pemasaran dijalankan menggunakan akaun WhatsApp peribadi. Akaun ini tidak mempunyai ciri automatik seperti WhatsApp Business, jadi saya membuat persediaan berikut supaya pertanyaan dapat diurus dengan cepat dan teratur:</w:t>
+      </w:r>
+    </w:p>
+    <w:p>
+      <w:pPr>
+        <w:pStyle w:val="ListParagraph"/>
+        <w:numPr>
+          <w:ilvl w:val="0"/>
+          <w:numId w:val="2"/>
+        </w:numPr>
+        <w:spacing w:after="80" w:line="320"/>
+      </w:pPr>
+      <w:r>
+        <w:t xml:space="preserve">Mengemas kini gambar profil dan ruangan Info dengan maklumat produk.</w:t>
+      </w:r>
+    </w:p>
+    <w:p>
+      <w:pPr>
+        <w:pStyle w:val="ListParagraph"/>
+        <w:numPr>
+          <w:ilvl w:val="0"/>
+          <w:numId w:val="2"/>
+        </w:numPr>
+        <w:spacing w:after="80" w:line="320"/>
+      </w:pPr>
+      <w:r>
+        <w:t xml:space="preserve">Menyediakan templat mesej balasan untuk salam, harga, cara pembayaran dan penghantaran fail. Templat ini disalin dan dihantar secara manual kepada setiap pelanggan.</w:t>
+      </w:r>
+    </w:p>
+    <w:p>
+      <w:pPr>
+        <w:pStyle w:val="ListParagraph"/>
+        <w:numPr>
+          <w:ilvl w:val="0"/>
+          <w:numId w:val="2"/>
+        </w:numPr>
+        <w:spacing w:after="80" w:line="320"/>
+      </w:pPr>
+      <w:r>
+        <w:t xml:space="preserve">Menyematkan (pin) chat pelanggan yang belum selesai supaya tidak tertinggal.</w:t>
       </w:r>
     </w:p>
     <w:tbl>
@@ -2264,7 +2303,7 @@
                 <w:sz w:val="18"/>
                 <w:szCs w:val="18"/>
               </w:rPr>
-              <w:t xml:space="preserve">[Tampal tangkap layar: profil perniagaan WhatsApp]</w:t>
+              <w:t xml:space="preserve">[Tampal tangkap layar: profil dan Info WhatsApp]</w:t>
             </w:r>
           </w:p>
         </w:tc>
@@ -2295,7 +2334,7 @@
                 <w:sz w:val="18"/>
                 <w:szCs w:val="18"/>
               </w:rPr>
-              <w:t xml:space="preserve">[Tampal tangkap layar: katalog produk RM15]</w:t>
+              <w:t xml:space="preserve">[Tampal tangkap layar: templat mesej yang disimpan]</w:t>
             </w:r>
           </w:p>
         </w:tc>
@@ -2323,7 +2362,7 @@
                 <w:sz w:val="18"/>
                 <w:szCs w:val="18"/>
               </w:rPr>
-              <w:t xml:space="preserve">Rajah 5: Profil perniagaan</w:t>
+              <w:t xml:space="preserve">Rajah 5: Profil WhatsApp</w:t>
             </w:r>
           </w:p>
         </w:tc>
@@ -2349,146 +2388,7 @@
                 <w:sz w:val="18"/>
                 <w:szCs w:val="18"/>
               </w:rPr>
-              <w:t xml:space="preserve">Rajah 6: Katalog produk</w:t>
-            </w:r>
-          </w:p>
-        </w:tc>
-      </w:tr>
-    </w:tbl>
-    <w:tbl>
-      <w:tblPr>
-        <w:tblW w:type="dxa" w:w="9026"/>
-        <w:tblBorders>
-          <w:top w:val="single" w:color="auto" w:sz="4"/>
-          <w:left w:val="single" w:color="auto" w:sz="4"/>
-          <w:bottom w:val="single" w:color="auto" w:sz="4"/>
-          <w:right w:val="single" w:color="auto" w:sz="4"/>
-          <w:insideH w:val="single" w:color="auto" w:sz="4"/>
-          <w:insideV w:val="single" w:color="auto" w:sz="4"/>
-        </w:tblBorders>
-      </w:tblPr>
-      <w:tblGrid>
-        <w:gridCol w:w="4513"/>
-        <w:gridCol w:w="4513"/>
-      </w:tblGrid>
-      <w:tr>
-        <w:trPr>
-          <w:cantSplit/>
-          <w:trHeight w:val="4600" w:hRule="exact"/>
-        </w:trPr>
-        <w:tc>
-          <w:tcPr>
-            <w:tcW w:type="dxa" w:w="4513"/>
-            <w:tcBorders>
-              <w:top w:val="dashed" w:color="999999" w:sz="6"/>
-              <w:left w:val="dashed" w:color="999999" w:sz="6"/>
-              <w:bottom w:val="dashed" w:color="999999" w:sz="6"/>
-              <w:right w:val="dashed" w:color="999999" w:sz="6"/>
-            </w:tcBorders>
-            <w:tcMar>
-              <w:left w:type="dxa" w:w="160"/>
-              <w:right w:type="dxa" w:w="160"/>
-            </w:tcMar>
-            <w:vAlign w:val="center"/>
-          </w:tcPr>
-          <w:p>
-            <w:pPr>
-              <w:jc w:val="center"/>
-            </w:pPr>
-            <w:r>
-              <w:rPr>
-                <w:i/>
-                <w:iCs/>
-                <w:color w:val="808080"/>
-                <w:sz w:val="18"/>
-                <w:szCs w:val="18"/>
-              </w:rPr>
-              <w:t xml:space="preserve">[Tampal tangkap layar: mesej sapaan automatik]</w:t>
-            </w:r>
-          </w:p>
-        </w:tc>
-        <w:tc>
-          <w:tcPr>
-            <w:tcW w:type="dxa" w:w="4513"/>
-            <w:tcBorders>
-              <w:top w:val="dashed" w:color="999999" w:sz="6"/>
-              <w:left w:val="dashed" w:color="999999" w:sz="6"/>
-              <w:bottom w:val="dashed" w:color="999999" w:sz="6"/>
-              <w:right w:val="dashed" w:color="999999" w:sz="6"/>
-            </w:tcBorders>
-            <w:tcMar>
-              <w:left w:type="dxa" w:w="160"/>
-              <w:right w:type="dxa" w:w="160"/>
-            </w:tcMar>
-            <w:vAlign w:val="center"/>
-          </w:tcPr>
-          <w:p>
-            <w:pPr>
-              <w:jc w:val="center"/>
-            </w:pPr>
-            <w:r>
-              <w:rPr>
-                <w:i/>
-                <w:iCs/>
-                <w:color w:val="808080"/>
-                <w:sz w:val="18"/>
-                <w:szCs w:val="18"/>
-              </w:rPr>
-              <w:t xml:space="preserve">[Tampal tangkap layar: senarai balasan pantas]</w:t>
-            </w:r>
-          </w:p>
-        </w:tc>
-      </w:tr>
-      <w:tr>
-        <w:tc>
-          <w:tcPr>
-            <w:tcW w:type="dxa" w:w="4513"/>
-            <w:tcBorders>
-              <w:top w:val="none" w:color="FFFFFF" w:sz="0"/>
-              <w:left w:val="none" w:color="FFFFFF" w:sz="0"/>
-              <w:bottom w:val="none" w:color="FFFFFF" w:sz="0"/>
-              <w:right w:val="none" w:color="FFFFFF" w:sz="0"/>
-            </w:tcBorders>
-          </w:tcPr>
-          <w:p>
-            <w:pPr>
-              <w:spacing w:after="200" w:before="80"/>
-              <w:jc w:val="center"/>
-            </w:pPr>
-            <w:r>
-              <w:rPr>
-                <w:i/>
-                <w:iCs/>
-                <w:sz w:val="18"/>
-                <w:szCs w:val="18"/>
-              </w:rPr>
-              <w:t xml:space="preserve">Rajah 7: Mesej sapaan automatik</w:t>
-            </w:r>
-          </w:p>
-        </w:tc>
-        <w:tc>
-          <w:tcPr>
-            <w:tcW w:type="dxa" w:w="4513"/>
-            <w:tcBorders>
-              <w:top w:val="none" w:color="FFFFFF" w:sz="0"/>
-              <w:left w:val="none" w:color="FFFFFF" w:sz="0"/>
-              <w:bottom w:val="none" w:color="FFFFFF" w:sz="0"/>
-              <w:right w:val="none" w:color="FFFFFF" w:sz="0"/>
-            </w:tcBorders>
-          </w:tcPr>
-          <w:p>
-            <w:pPr>
-              <w:spacing w:after="200" w:before="80"/>
-              <w:jc w:val="center"/>
-            </w:pPr>
-            <w:r>
-              <w:rPr>
-                <w:i/>
-                <w:iCs/>
-                <w:sz w:val="18"/>
-                <w:szCs w:val="18"/>
-              </w:rPr>
-              <w:t xml:space="preserve">Rajah 8: Balasan pantas</w:t>
+              <w:t xml:space="preserve">Rajah 6: Templat mesej balasan</w:t>
             </w:r>
           </w:p>
         </w:tc>
@@ -3371,7 +3271,7 @@
                 <w:sz w:val="18"/>
                 <w:szCs w:val="18"/>
               </w:rPr>
-              <w:t xml:space="preserve">Rajah 9: Contoh status WhatsApp</w:t>
+              <w:t xml:space="preserve">Rajah 7: Contoh status WhatsApp</w:t>
             </w:r>
           </w:p>
         </w:tc>
@@ -3397,7 +3297,7 @@
                 <w:sz w:val="18"/>
                 <w:szCs w:val="18"/>
               </w:rPr>
-              <w:t xml:space="preserve">Rajah 10: Bilangan tontonan status</w:t>
+              <w:t xml:space="preserve">Rajah 8: Bilangan tontonan status</w:t>
             </w:r>
           </w:p>
         </w:tc>
@@ -3547,7 +3447,7 @@
                 <w:sz w:val="18"/>
                 <w:szCs w:val="18"/>
               </w:rPr>
-              <w:t xml:space="preserve">Rajah 11: Mesej senarai siaran</w:t>
+              <w:t xml:space="preserve">Rajah 9: Mesej senarai siaran</w:t>
             </w:r>
           </w:p>
         </w:tc>
@@ -3573,7 +3473,7 @@
                 <w:sz w:val="18"/>
                 <w:szCs w:val="18"/>
               </w:rPr>
-              <w:t xml:space="preserve">Rajah 12: Perkongsian dalam kumpulan WhatsApp</w:t>
+              <w:t xml:space="preserve">Rajah 10: Perkongsian dalam kumpulan WhatsApp</w:t>
             </w:r>
           </w:p>
         </w:tc>
@@ -4326,7 +4226,7 @@
                 <w:sz w:val="18"/>
                 <w:szCs w:val="18"/>
               </w:rPr>
-              <w:t xml:space="preserve">Rajah 13: Hantaran di media sosial</w:t>
+              <w:t xml:space="preserve">Rajah 11: Hantaran di media sosial</w:t>
             </w:r>
           </w:p>
         </w:tc>
@@ -4352,7 +4252,7 @@
                 <w:sz w:val="18"/>
                 <w:szCs w:val="18"/>
               </w:rPr>
-              <w:t xml:space="preserve">Rajah 14: Statistik hantaran</w:t>
+              <w:t xml:space="preserve">Rajah 12: Statistik hantaran</w:t>
             </w:r>
           </w:p>
         </w:tc>
@@ -4372,7 +4272,7 @@
         <w:jc w:val="both"/>
       </w:pPr>
       <w:r>
-        <w:t xml:space="preserve">Setiap pertanyaan diurus mengikut aliran dalam Rajah di bawah. Pelanggan yang membeli dihantar fail PDF selepas pembayaran disahkan, manakala pelanggan yang belum membeli dihantar satu mesej susulan.</w:t>
+        <w:t xml:space="preserve">Setiap pertanyaan dibalas secara manual menggunakan templat mesej, mengikut aliran dalam Rajah di bawah. Pelanggan yang membeli dihantar fail PDF selepas pembayaran disahkan, manakala pelanggan yang belum membeli dihantar satu mesej susulan.</w:t>
       </w:r>
     </w:p>
     <w:p>
@@ -4383,7 +4283,7 @@
       <w:r>
         <w:drawing>
           <wp:inline distT="0" distB="0" distL="0" distR="0">
-            <wp:extent cx="5334000" cy="2295525"/>
+            <wp:extent cx="5334000" cy="2247900"/>
             <wp:effectExtent t="0" r="0" b="0" l="0"/>
             <wp:docPr id="1" name="" descr="" title=""/>
             <wp:cNvGraphicFramePr>
@@ -4408,7 +4308,7 @@
                   <pic:spPr bwMode="auto">
                     <a:xfrm>
                       <a:off x="0" y="0"/>
-                      <a:ext cx="5334000" cy="2295525"/>
+                      <a:ext cx="5334000" cy="2247900"/>
                     </a:xfrm>
                     <a:prstGeom prst="rect">
                       <a:avLst/>
@@ -4433,7 +4333,7 @@
           <w:sz w:val="18"/>
           <w:szCs w:val="18"/>
         </w:rPr>
-        <w:t xml:space="preserve">Rajah 15: Aliran pengurusan pertanyaan dan jualan</w:t>
+        <w:t xml:space="preserve">Rajah 13: Aliran pengurusan pertanyaan dan jualan</w:t>
       </w:r>
     </w:p>
     <w:p>
@@ -4559,7 +4459,7 @@
                 <w:sz w:val="18"/>
                 <w:szCs w:val="18"/>
               </w:rPr>
-              <w:t xml:space="preserve">Rajah 16: Contoh pertanyaan pelanggan</w:t>
+              <w:t xml:space="preserve">Rajah 14: Contoh pertanyaan pelanggan</w:t>
             </w:r>
           </w:p>
         </w:tc>
@@ -4585,7 +4485,7 @@
                 <w:sz w:val="18"/>
                 <w:szCs w:val="18"/>
               </w:rPr>
-              <w:t xml:space="preserve">Rajah 17: Penghantaran fail kepada pembeli</w:t>
+              <w:t xml:space="preserve">Rajah 15: Penghantaran fail kepada pembeli</w:t>
             </w:r>
           </w:p>
         </w:tc>
@@ -5000,7 +4900,7 @@
                 <w:sz w:val="20"/>
                 <w:szCs w:val="20"/>
               </w:rPr>
-              <w:t xml:space="preserve">Rajah 9</w:t>
+              <w:t xml:space="preserve">Rajah 7</w:t>
             </w:r>
           </w:p>
         </w:tc>
@@ -7538,7 +7438,7 @@
                 <w:sz w:val="20"/>
                 <w:szCs w:val="20"/>
               </w:rPr>
-              <w:t xml:space="preserve">Pertanyaan diterima di luar waktu kerja</w:t>
+              <w:t xml:space="preserve">Akaun WhatsApp peribadi tiada mesej automatik</w:t>
             </w:r>
           </w:p>
         </w:tc>
@@ -7566,7 +7466,7 @@
                 <w:sz w:val="20"/>
                 <w:szCs w:val="20"/>
               </w:rPr>
-              <w:t xml:space="preserve">Memasang mesej tidak hadir supaya pelanggan tahu bila akan dibalas</w:t>
+              <w:t xml:space="preserve">Menyediakan templat mesej yang boleh disalin dan dihantar dengan cepat</w:t>
             </w:r>
           </w:p>
         </w:tc>
@@ -7599,7 +7499,7 @@
                 <w:sz w:val="20"/>
                 <w:szCs w:val="20"/>
               </w:rPr>
-              <w:t xml:space="preserve">Soalan yang sama ditanya berulang kali</w:t>
+              <w:t xml:space="preserve">Pertanyaan diterima di luar waktu kerja</w:t>
             </w:r>
           </w:p>
         </w:tc>
@@ -7627,7 +7527,7 @@
                 <w:sz w:val="20"/>
                 <w:szCs w:val="20"/>
               </w:rPr>
-              <w:t xml:space="preserve">Menyediakan balasan pantas seperti /senarai, /bayar dan /cetak</w:t>
+              <w:t xml:space="preserve">Membalas seawal mungkin keesokan harinya dan menyematkan chat yang belum dibalas</w:t>
             </w:r>
           </w:p>
         </w:tc>
@@ -7839,7 +7739,7 @@
         <w:spacing w:after="80" w:line="320"/>
       </w:pPr>
       <w:r>
-        <w:t xml:space="preserve">Menggunakan ciri WhatsApp Business seperti katalog, mesej automatik, balasan pantas dan label.</w:t>
+        <w:t xml:space="preserve">Menggunakan ciri WhatsApp seperti Status, senarai siaran dan kumpulan untuk tujuan pemasaran.</w:t>
       </w:r>
     </w:p>
     <w:p>
@@ -7942,7 +7842,7 @@
         <w:spacing w:after="80" w:line="320"/>
       </w:pPr>
       <w:r>
-        <w:t xml:space="preserve">Menggunakan aplikasi chatbot bagi membalas pertanyaan secara automatik apabila jualan meningkat.</w:t>
+        <w:t xml:space="preserve">Beralih kepada WhatsApp Business supaya boleh menggunakan katalog, mesej sapaan automatik, balasan pantas dan label pelanggan.</w:t>
       </w:r>
     </w:p>
     <w:p>
@@ -7972,7 +7872,7 @@
         <w:jc w:val="both"/>
       </w:pPr>
       <w:r>
-        <w:t xml:space="preserve">Secara keseluruhannya, WhatsApp dan media sosial merupakan saluran yang berkesan untuk memasarkan produk digital seperti e-book buku mewarna. Ciri WhatsApp Business membantu saya mengurus pertanyaan dengan lebih cepat dan teratur.</w:t>
+        <w:t xml:space="preserve">Secara keseluruhannya, WhatsApp dan media sosial merupakan saluran yang berkesan untuk memasarkan produk digital seperti e-book buku mewarna. Walaupun menggunakan akaun peribadi, Status dan senarai siaran WhatsApp membantu saya mencapai ramai kenalan dengan cepat, manakala templat mesej memudahkan saya membalas pertanyaan.</w:t>
       </w:r>
     </w:p>
     <w:p>
@@ -8118,7 +8018,7 @@
         <w:pStyle w:val="Heading1"/>
       </w:pPr>
       <w:r>
-        <w:t xml:space="preserve">LAMPIRAN A: MESEJ AUTO-BALAS WHATSAPP</w:t>
+        <w:t xml:space="preserve">LAMPIRAN A: TEMPLAT MESEJ BALASAN WHATSAPP</w:t>
       </w:r>
     </w:p>
     <w:p>
@@ -8127,7 +8027,7 @@
         <w:jc w:val="both"/>
       </w:pPr>
       <w:r>
-        <w:t xml:space="preserve">Mesej sapaan automatik yang dipasang pada akaun WhatsApp Business:</w:t>
+        <w:t xml:space="preserve">Templat mesej salam yang dihantar kepada setiap pelanggan yang bertanya:</w:t>
       </w:r>
     </w:p>
     <w:p>
@@ -8310,7 +8210,7 @@
         <w:jc w:val="both"/>
       </w:pPr>
       <w:r>
-        <w:t xml:space="preserve">Balasan pantas yang disediakan: /senarai, /bayar, /terima, /cetak, /syarat, /susulan dan /terimakasih.</w:t>
+        <w:t xml:space="preserve">Templat lain yang disediakan: senarai buku, cara pembayaran, penghantaran fail, tip mencetak, syarat penggunaan, mesej susulan dan ucapan terima kasih.</w:t>
       </w:r>
     </w:p>
     <w:p>
@@ -8433,7 +8333,7 @@
                 <w:sz w:val="18"/>
                 <w:szCs w:val="18"/>
               </w:rPr>
-              <w:t xml:space="preserve">Rajah 18: Bukti tambahan</w:t>
+              <w:t xml:space="preserve">Rajah 16: Bukti tambahan</w:t>
             </w:r>
           </w:p>
         </w:tc>
@@ -8459,7 +8359,7 @@
                 <w:sz w:val="18"/>
                 <w:szCs w:val="18"/>
               </w:rPr>
-              <w:t xml:space="preserve">Rajah 19: Bukti tambahan</w:t>
+              <w:t xml:space="preserve">Rajah 17: Bukti tambahan</w:t>
             </w:r>
           </w:p>
         </w:tc>
@@ -8572,7 +8472,7 @@
                 <w:sz w:val="18"/>
                 <w:szCs w:val="18"/>
               </w:rPr>
-              <w:t xml:space="preserve">Rajah 20: Bukti tambahan</w:t>
+              <w:t xml:space="preserve">Rajah 18: Bukti tambahan</w:t>
             </w:r>
           </w:p>
         </w:tc>
@@ -8598,7 +8498,7 @@
                 <w:sz w:val="18"/>
                 <w:szCs w:val="18"/>
               </w:rPr>
-              <w:t xml:space="preserve">Rajah 21: Bukti tambahan</w:t>
+              <w:t xml:space="preserve">Rajah 19: Bukti tambahan</w:t>
             </w:r>
           </w:p>
         </w:tc>

</xml_diff>